<commit_message>
fix(status): the Authorize button opens the proxy's browser-facing URL
AUTH_URL was built from PROXY_URL, the server's loopback address, so the
button opened 127.0.0.1:8100 on the VIEWER's device and found nothing.
New machine-local `proxy_public_url` (env.local.toml) -> PROXY_PUBLIC_URL,
set on the VPS to the `tailscale serve` address of :8100. Falls back to
PROXY_URL; pinned to it under pytest. Server traffic is unchanged.

Co-Authored-By: Claude Opus 5 <noreply@anthropic.com>
</commit_message>
<xml_diff>
--- a/docs/manuals/technical-reference/technical-reference.docx
+++ b/docs/manuals/technical-reference/technical-reference.docx
@@ -2947,7 +2947,27 @@
             <w:r/>
             <w:r>
               <w:rPr/>
-              <w:t xml:space="preserve">Start the proxy, then open </w:t>
+              <w:t xml:space="preserve">Start the proxy, then use the </w:t>
+            </w:r>
+            <w:r>
+              <w:rPr>
+                <w:b/>
+              </w:rPr>
+              <w:t>Authorize</w:t>
+            </w:r>
+            <w:r>
+              <w:rPr/>
+              <w:t xml:space="preserve"> button on the app's </w:t>
+            </w:r>
+            <w:r>
+              <w:rPr>
+                <w:b/>
+              </w:rPr>
+              <w:t>System Status</w:t>
+            </w:r>
+            <w:r>
+              <w:rPr/>
+              <w:t xml:space="preserve"> page and complete the Schwab login. The button opens </w:t>
             </w:r>
             <w:r>
               <w:rPr>
@@ -2955,31 +2975,71 @@
                 <w:color w:val="334455"/>
                 <w:sz w:val="19"/>
               </w:rPr>
+              <w:t>{proxy_public_url}/auth</w:t>
+            </w:r>
+            <w:r>
+              <w:rPr/>
+              <w:t xml:space="preserve"> (</w:t>
+            </w:r>
+            <w:r>
+              <w:rPr>
+                <w:rFonts w:ascii="Consolas" w:hAnsi="Consolas"/>
+                <w:color w:val="334455"/>
+                <w:sz w:val="19"/>
+              </w:rPr>
+              <w:t>repo_paths.PROXY_PUBLIC_URL</w:t>
+            </w:r>
+            <w:r>
+              <w:rPr/>
+              <w:t xml:space="preserve">, from </w:t>
+            </w:r>
+            <w:r>
+              <w:rPr>
+                <w:rFonts w:ascii="Consolas" w:hAnsi="Consolas"/>
+                <w:color w:val="334455"/>
+                <w:sz w:val="19"/>
+              </w:rPr>
+              <w:t>config/env.local.toml</w:t>
+            </w:r>
+            <w:r>
+              <w:rPr/>
+              <w:t xml:space="preserve">) — on the VPS the </w:t>
+            </w:r>
+            <w:r>
+              <w:rPr>
+                <w:rFonts w:ascii="Consolas" w:hAnsi="Consolas"/>
+                <w:color w:val="334455"/>
+                <w:sz w:val="19"/>
+              </w:rPr>
+              <w:t>tailscale serve</w:t>
+            </w:r>
+            <w:r>
+              <w:rPr/>
+              <w:t xml:space="preserve"> address of </w:t>
+            </w:r>
+            <w:r>
+              <w:rPr>
+                <w:rFonts w:ascii="Consolas" w:hAnsi="Consolas"/>
+                <w:color w:val="334455"/>
+                <w:sz w:val="19"/>
+              </w:rPr>
+              <w:t>:8100</w:t>
+            </w:r>
+            <w:r>
+              <w:rPr/>
+              <w:t xml:space="preserve">; unset, </w:t>
+            </w:r>
+            <w:r>
+              <w:rPr>
+                <w:rFonts w:ascii="Consolas" w:hAnsi="Consolas"/>
+                <w:color w:val="334455"/>
+                <w:sz w:val="19"/>
+              </w:rPr>
               <w:t>http://127.0.0.1:8100/auth</w:t>
             </w:r>
             <w:r>
               <w:rPr/>
-              <w:t xml:space="preserve"> (or the </w:t>
-            </w:r>
-            <w:r>
-              <w:rPr>
-                <w:b/>
-              </w:rPr>
-              <w:t>Authorize</w:t>
-            </w:r>
-            <w:r>
-              <w:rPr/>
-              <w:t xml:space="preserve"> button on the app's </w:t>
-            </w:r>
-            <w:r>
-              <w:rPr>
-                <w:b/>
-              </w:rPr>
-              <w:t>System Status</w:t>
-            </w:r>
-            <w:r>
-              <w:rPr/>
-              <w:t xml:space="preserve"> page) and complete the Schwab login.</w:t>
+              <w:t>, reachable only on the same machine or through the SSH tunnel.</w:t>
             </w:r>
           </w:p>
         </w:tc>

</xml_diff>

<commit_message>
docs(finder): a reachable empty-pick example; run and review-list corrections
The empty-pick example (Next 30 days with DTE min at 60, Scanned 0 of 56)
could not occur: a choice applies only above 30 expirations in range, and
expiration_count is the in-range count. It is now $SPX with DTE min at 31 -
33 in range, none within 30 days, Scanned 0 of 33 - in the CHANGELOG, User
Guide, page help and the no_data_label docstring.

Monthlies are their own run only where weeklies sit between them; far-dated
neighbours share one. An IV reference that fails to load with no chosen
expiry above 0 DTE leaves no ATM IV rather than a fallback. The CHANGELOG
review list gains the degrade-to-ordinary-lines fix, the negative DTE min
clamp and the Change aria-label and focus underline; the kept IV reference
moves to the feature description. CLAUDE.md's route row keeps the
invariant without the dated measurement.

Co-Authored-By: Claude Opus 5 <noreply@anthropic.com>
</commit_message>
<xml_diff>
--- a/docs/manuals/technical-reference/technical-reference.docx
+++ b/docs/manuals/technical-reference/technical-reference.docx
@@ -16551,9 +16551,11 @@
       </w:r>
       <w:r>
         <w:rPr/>
-        <w:t>: runs consecutive in the listing, each cut to 8 — so monthlies, which are not</w:t>
-        <w:br/>
-        <w:t xml:space="preserve">neighbours, are one run each) and the chain is </w:t>
+        <w:t>: runs consecutive in the listing, each cut to 8 — so a monthly with weeklies</w:t>
+        <w:br/>
+        <w:t>listed between it and the next is a run of its own, while far-dated monthlies that are</w:t>
+        <w:br/>
+        <w:t xml:space="preserve">neighbours in the listing share one) and the chain is </w:t>
       </w:r>
       <w:r>
         <w:rPr>
@@ -16694,8 +16696,37 @@
       </w:r>
       <w:r>
         <w:rPr/>
-        <w:br/>
-        <w:t xml:space="preserve">(the analysis falls back to a chosen expiry). </w:t>
+        <w:t>,</w:t>
+        <w:br/>
+        <w:t xml:space="preserve">and </w:t>
+      </w:r>
+      <w:r>
+        <w:rPr>
+          <w:rFonts w:ascii="Consolas" w:hAnsi="Consolas"/>
+          <w:color w:val="334455"/>
+          <w:sz w:val="19"/>
+        </w:rPr>
+        <w:t>extract_atm_iv</w:t>
+      </w:r>
+      <w:r>
+        <w:rPr/>
+        <w:t xml:space="preserve"> then reads the chosen expiry nearest 30 DTE instead (inside 7–60,</w:t>
+        <w:br/>
+        <w:t xml:space="preserve">else any above 0) — or, when no chosen expiry is more than 0 DTE, returns </w:t>
+      </w:r>
+      <w:r>
+        <w:rPr>
+          <w:rFonts w:ascii="Consolas" w:hAnsi="Consolas"/>
+          <w:color w:val="334455"/>
+          <w:sz w:val="19"/>
+        </w:rPr>
+        <w:t>None</w:t>
+      </w:r>
+      <w:r>
+        <w:rPr/>
+        <w:t>, so the</w:t>
+        <w:br/>
+        <w:t xml:space="preserve">scan has no ATM IV rather than a fallback one. </w:t>
       </w:r>
       <w:r>
         <w:rPr>

</xml_diff>

<commit_message>
feat(capture): cap open captured signals at two per symbol, across scanner types
The Income board captured every candidate it published and stacked seven open
SPY call credit spreads over 09-15/16; ORCL reached 16 via 0-DTE on 09-08.
record_signals now holds each symbol to [capture] max_open_per_symbol (2, 0 =
off) OPEN captures counted across 0DTE/SWING/INCOME, highest score first, fail
closed when the open count cannot be read.

Co-Authored-By: Claude Opus 5 <noreply@anthropic.com>
</commit_message>
<xml_diff>
--- a/docs/manuals/technical-reference/technical-reference.docx
+++ b/docs/manuals/technical-reference/technical-reference.docx
@@ -13404,7 +13404,35 @@
         <w:br/>
         <w:t>a row whose score crosses the board's own 50 cut is the only way the published — and so</w:t>
         <w:br/>
-        <w:t>captured — set can differ. Flies, condors, calendars</w:t>
+        <w:t>captured — set can differ (apart from the per-symbol cap: since 2026-09-16</w:t>
+        <w:br/>
+      </w:r>
+      <w:r>
+        <w:rPr>
+          <w:rFonts w:ascii="Consolas" w:hAnsi="Consolas"/>
+          <w:color w:val="334455"/>
+          <w:sz w:val="19"/>
+        </w:rPr>
+        <w:t>signal_recorder.record_signals</w:t>
+      </w:r>
+      <w:r>
+        <w:rPr/>
+        <w:t xml:space="preserve"> holds each symbol to </w:t>
+      </w:r>
+      <w:r>
+        <w:rPr>
+          <w:rFonts w:ascii="Consolas" w:hAnsi="Consolas"/>
+          <w:color w:val="334455"/>
+          <w:sz w:val="19"/>
+        </w:rPr>
+        <w:t>[capture] max_open_per_symbol</w:t>
+      </w:r>
+      <w:r>
+        <w:rPr/>
+        <w:br/>
+        <w:t>= 2 OPEN captures across all scanner types, highest score first, and captures nothing</w:t>
+        <w:br/>
+        <w:t>if it cannot read the open count). Flies, condors, calendars</w:t>
         <w:br/>
         <w:t xml:space="preserve">and the short straddle/strangle carry </w:t>
       </w:r>

</xml_diff>

<commit_message>
feat(webgui): per-section Desk spoken alerts, and the Opportunity Board speaks
Settings -> Spoken alerts (Desk) gains three switches under the main one:
Opportunity Board, Live Flow Alerts, Positions (voice_board / voice_flow /
voice_positions, default on, greyed while voice_enabled is off). Every
section's fold still runs so rows glow and a re-enabled section announces
nothing stale; only the sentence is dropped.

A symbol joining the board's top six now speaks ("N V D A. Joins the
Opportunity Board, buy signal."); one that left within 30 minutes glows
silently, so names swapping at sixth and a board reappearing after an
empty matrix stay quiet. The flow-clip prewarm also needs voice_flow.

Co-Authored-By: Claude Opus 5 <noreply@anthropic.com>
</commit_message>
<xml_diff>
--- a/docs/manuals/technical-reference/technical-reference.docx
+++ b/docs/manuals/technical-reference/technical-reference.docx
@@ -34139,6 +34139,159 @@
                 <w:sz w:val="19"/>
               </w:rPr>
               <w:t>voice.py:_PART_MAX_AGE_SEC</w:t>
+            </w:r>
+          </w:p>
+        </w:tc>
+      </w:tr>
+      <w:tr>
+        <w:tc>
+          <w:tcPr>
+            <w:tcW w:type="dxa" w:w="2880"/>
+          </w:tcPr>
+          <w:p>
+            <w:r/>
+            <w:r>
+              <w:rPr/>
+              <w:t>Board re-entry quiet</w:t>
+            </w:r>
+          </w:p>
+        </w:tc>
+        <w:tc>
+          <w:tcPr>
+            <w:tcW w:type="dxa" w:w="2880"/>
+          </w:tcPr>
+          <w:p>
+            <w:r/>
+            <w:r>
+              <w:rPr/>
+              <w:t xml:space="preserve">a symbol back on the Opportunity Board within </w:t>
+            </w:r>
+            <w:r>
+              <w:rPr>
+                <w:b/>
+              </w:rPr>
+              <w:t>1800 s</w:t>
+            </w:r>
+            <w:r>
+              <w:rPr/>
+              <w:t xml:space="preserve"> of leaving glows but is not spoken</w:t>
+            </w:r>
+          </w:p>
+        </w:tc>
+        <w:tc>
+          <w:tcPr>
+            <w:tcW w:type="dxa" w:w="2880"/>
+          </w:tcPr>
+          <w:p>
+            <w:r/>
+            <w:r>
+              <w:rPr>
+                <w:rFonts w:ascii="Consolas" w:hAnsi="Consolas"/>
+                <w:color w:val="334455"/>
+                <w:sz w:val="19"/>
+              </w:rPr>
+              <w:t>desk.py:BOARD_REENTRY_QUIET_SEC</w:t>
+            </w:r>
+          </w:p>
+        </w:tc>
+      </w:tr>
+      <w:tr>
+        <w:tc>
+          <w:tcPr>
+            <w:tcW w:type="dxa" w:w="2880"/>
+            <w:shd w:val="clear" w:color="auto" w:fill="F4F6FA"/>
+          </w:tcPr>
+          <w:p>
+            <w:r/>
+            <w:r>
+              <w:rPr/>
+              <w:t>Section switches</w:t>
+            </w:r>
+          </w:p>
+        </w:tc>
+        <w:tc>
+          <w:tcPr>
+            <w:tcW w:type="dxa" w:w="2880"/>
+            <w:shd w:val="clear" w:color="auto" w:fill="F4F6FA"/>
+          </w:tcPr>
+          <w:p>
+            <w:r/>
+            <w:r>
+              <w:rPr>
+                <w:rFonts w:ascii="Consolas" w:hAnsi="Consolas"/>
+                <w:color w:val="334455"/>
+                <w:sz w:val="19"/>
+              </w:rPr>
+              <w:t>voice_board</w:t>
+            </w:r>
+            <w:r>
+              <w:rPr/>
+              <w:t xml:space="preserve"> · </w:t>
+            </w:r>
+            <w:r>
+              <w:rPr>
+                <w:rFonts w:ascii="Consolas" w:hAnsi="Consolas"/>
+                <w:color w:val="334455"/>
+                <w:sz w:val="19"/>
+              </w:rPr>
+              <w:t>voice_flow</w:t>
+            </w:r>
+            <w:r>
+              <w:rPr/>
+              <w:t xml:space="preserve"> · </w:t>
+            </w:r>
+            <w:r>
+              <w:rPr>
+                <w:rFonts w:ascii="Consolas" w:hAnsi="Consolas"/>
+                <w:color w:val="334455"/>
+                <w:sz w:val="19"/>
+              </w:rPr>
+              <w:t>voice_positions</w:t>
+            </w:r>
+            <w:r>
+              <w:rPr/>
+              <w:t xml:space="preserve">, each under </w:t>
+            </w:r>
+            <w:r>
+              <w:rPr>
+                <w:rFonts w:ascii="Consolas" w:hAnsi="Consolas"/>
+                <w:color w:val="334455"/>
+                <w:sz w:val="19"/>
+              </w:rPr>
+              <w:t>voice_enabled</w:t>
+            </w:r>
+            <w:r>
+              <w:rPr/>
+              <w:t>; detection still runs for a silenced section so re-enabling it announces nothing stale</w:t>
+            </w:r>
+          </w:p>
+        </w:tc>
+        <w:tc>
+          <w:tcPr>
+            <w:tcW w:type="dxa" w:w="2880"/>
+            <w:shd w:val="clear" w:color="auto" w:fill="F4F6FA"/>
+          </w:tcPr>
+          <w:p>
+            <w:r/>
+            <w:r>
+              <w:rPr>
+                <w:rFonts w:ascii="Consolas" w:hAnsi="Consolas"/>
+                <w:color w:val="334455"/>
+                <w:sz w:val="19"/>
+              </w:rPr>
+              <w:t>desk.py:VOICE_SECTIONS</w:t>
+            </w:r>
+            <w:r>
+              <w:rPr/>
+              <w:t xml:space="preserve">, </w:t>
+            </w:r>
+            <w:r>
+              <w:rPr>
+                <w:rFonts w:ascii="Consolas" w:hAnsi="Consolas"/>
+                <w:color w:val="334455"/>
+                <w:sz w:val="19"/>
+              </w:rPr>
+              <w:t>detect_utterances</w:t>
             </w:r>
           </w:p>
         </w:tc>

</xml_diff>

<commit_message>
docs: remove Claude Trades from CLAUDE.md, the manuals and the runbooks
Deletes the driver-only CLAUDE.md sections (the two-path risk envelope, the
halt latch, the equity-scaled caps), corrects service counts, ports and unit
counts in place (five services on 8210-8213 and 8215; nine prod units), and
rewrites the scorecard section around book_perf. The five manuals,
webgui-routes, SECURITY, README, CADENCES, CI and the dev/prod runbook lose
their driver content; the manuals are rebuilt. Design note and CHANGELOG
entry added.

Co-Authored-By: Claude Opus 5.5 <noreply@anthropic.com>
</commit_message>
<xml_diff>
--- a/docs/manuals/technical-reference/technical-reference.docx
+++ b/docs/manuals/technical-reference/technical-reference.docx
@@ -32,7 +32,7 @@
           <w:color w:val="5B6678"/>
           <w:sz w:val="18"/>
         </w:rPr>
-        <w:t>NeuralStrike · Generated 2026-09-21</w:t>
+        <w:t>NeuralStrike · Generated 2026-09-22</w:t>
       </w:r>
     </w:p>
     <w:p/>
@@ -1006,7 +1006,7 @@
               <w:rPr>
                 <w:b/>
               </w:rPr>
-              <w:t>Claude Trades</w:t>
+              <w:t>Portfolio</w:t>
             </w:r>
           </w:p>
         </w:tc>
@@ -1018,24 +1018,10 @@
           <w:p>
             <w:r/>
             <w:r>
-              <w:rPr/>
-              <w:t xml:space="preserve">Its risk clamping is pure code, not a formula — see the </w:t>
-            </w:r>
-            <w:r>
               <w:rPr>
                 <w:i/>
               </w:rPr>
-              <w:t>API / Developer Reference</w:t>
-            </w:r>
-            <w:r>
-              <w:rPr/>
-              <w:t xml:space="preserve">, </w:t>
-            </w:r>
-            <w:r>
-              <w:rPr>
-                <w:b/>
-              </w:rPr>
-              <w:t>Driver service</w:t>
+              <w:t>Portfolio Analytics</w:t>
             </w:r>
           </w:p>
         </w:tc>
@@ -1051,45 +1037,13 @@
               <w:rPr>
                 <w:b/>
               </w:rPr>
-              <w:t>Portfolio</w:t>
+              <w:t>EOD Report</w:t>
             </w:r>
           </w:p>
         </w:tc>
         <w:tc>
           <w:tcPr>
             <w:tcW w:type="dxa" w:w="4320"/>
-          </w:tcPr>
-          <w:p>
-            <w:r/>
-            <w:r>
-              <w:rPr>
-                <w:i/>
-              </w:rPr>
-              <w:t>Portfolio Analytics</w:t>
-            </w:r>
-          </w:p>
-        </w:tc>
-      </w:tr>
-      <w:tr>
-        <w:tc>
-          <w:tcPr>
-            <w:tcW w:type="dxa" w:w="4320"/>
-            <w:shd w:val="clear" w:color="auto" w:fill="F4F6FA"/>
-          </w:tcPr>
-          <w:p>
-            <w:r/>
-            <w:r>
-              <w:rPr>
-                <w:b/>
-              </w:rPr>
-              <w:t>EOD Report</w:t>
-            </w:r>
-          </w:p>
-        </w:tc>
-        <w:tc>
-          <w:tcPr>
-            <w:tcW w:type="dxa" w:w="4320"/>
-            <w:shd w:val="clear" w:color="auto" w:fill="F4F6FA"/>
           </w:tcPr>
           <w:p>
             <w:r/>
@@ -1996,7 +1950,7 @@
             <w:r/>
             <w:r>
               <w:rPr/>
-              <w:t>The proxy + the six domain services.</w:t>
+              <w:t>The proxy + the five domain services.</w:t>
             </w:r>
           </w:p>
         </w:tc>
@@ -2260,7 +2214,7 @@
                 <w:color w:val="334455"/>
                 <w:sz w:val="19"/>
               </w:rPr>
-              <w:t>apscheduler==3.10.4</w:t>
+              <w:t>anthropic==0.112.0</w:t>
             </w:r>
           </w:p>
         </w:tc>
@@ -2272,7 +2226,7 @@
             <w:r/>
             <w:r>
               <w:rPr/>
-              <w:t>Driver scheduling.</w:t>
+              <w:t>Claude tool-use calls (imported lazily — the suite runs without it configured).</w:t>
             </w:r>
           </w:p>
         </w:tc>
@@ -2291,38 +2245,19 @@
                 <w:color w:val="334455"/>
                 <w:sz w:val="19"/>
               </w:rPr>
-              <w:t>anthropic==0.112.0</w:t>
-            </w:r>
-          </w:p>
-        </w:tc>
-        <w:tc>
-          <w:tcPr>
-            <w:tcW w:type="dxa" w:w="4320"/>
-            <w:shd w:val="clear" w:color="auto" w:fill="F4F6FA"/>
-          </w:tcPr>
-          <w:p>
-            <w:r/>
-            <w:r>
-              <w:rPr/>
-              <w:t>Claude tool-use calls (imported lazily — the suite runs without it configured).</w:t>
-            </w:r>
-          </w:p>
-        </w:tc>
-      </w:tr>
-      <w:tr>
-        <w:tc>
-          <w:tcPr>
-            <w:tcW w:type="dxa" w:w="4320"/>
-          </w:tcPr>
-          <w:p>
-            <w:r/>
+              <w:t>matplotlib</w:t>
+            </w:r>
+            <w:r>
+              <w:rPr/>
+              <w:t xml:space="preserve">, </w:t>
+            </w:r>
             <w:r>
               <w:rPr>
                 <w:rFonts w:ascii="Consolas" w:hAnsi="Consolas"/>
                 <w:color w:val="334455"/>
                 <w:sz w:val="19"/>
               </w:rPr>
-              <w:t>matplotlib</w:t>
+              <w:t>Pillow</w:t>
             </w:r>
             <w:r>
               <w:rPr/>
@@ -2334,18 +2269,6 @@
                 <w:color w:val="334455"/>
                 <w:sz w:val="19"/>
               </w:rPr>
-              <w:t>Pillow</w:t>
-            </w:r>
-            <w:r>
-              <w:rPr/>
-              <w:t xml:space="preserve">, </w:t>
-            </w:r>
-            <w:r>
-              <w:rPr>
-                <w:rFonts w:ascii="Consolas" w:hAnsi="Consolas"/>
-                <w:color w:val="334455"/>
-                <w:sz w:val="19"/>
-              </w:rPr>
               <w:t>yfinance</w:t>
             </w:r>
           </w:p>
@@ -2353,6 +2276,7 @@
         <w:tc>
           <w:tcPr>
             <w:tcW w:type="dxa" w:w="4320"/>
+            <w:shd w:val="clear" w:color="auto" w:fill="F4F6FA"/>
           </w:tcPr>
           <w:p>
             <w:r/>
@@ -2549,7 +2473,7 @@
               <w:rPr>
                 <w:b/>
               </w:rPr>
-              <w:t>without it none of the six services can publish and every page shows a "Waiting for … service" placeholder.</w:t>
+              <w:t>without it none of the five services can publish and every page shows a "Waiting for … service" placeholder.</w:t>
             </w:r>
             <w:r>
               <w:rPr/>
@@ -3362,7 +3286,7 @@
             </w:r>
             <w:r>
               <w:rPr/>
-              <w:t xml:space="preserve">. Powers the Driver's Claude decision layer, the Gamma </w:t>
+              <w:t xml:space="preserve">. Powers the Gamma </w:t>
             </w:r>
             <w:r>
               <w:rPr>
@@ -3382,7 +3306,7 @@
             </w:r>
             <w:r>
               <w:rPr/>
-              <w:t xml:space="preserve"> infographics, and the </w:t>
+              <w:t xml:space="preserve"> infographics and the </w:t>
             </w:r>
             <w:r>
               <w:rPr>
@@ -3595,19 +3519,7 @@
       </w:r>
       <w:r>
         <w:rPr/>
-        <w:t xml:space="preserve"> — most importantly the autonomous</w:t>
-        <w:br/>
-        <w:t xml:space="preserve">driver </w:t>
-      </w:r>
-      <w:r>
-        <w:rPr>
-          <w:b/>
-        </w:rPr>
-        <w:t>stands down rather than trading blind</w:t>
-      </w:r>
-      <w:r>
-        <w:rPr/>
-        <w:t>, and the Gamma infographics render</w:t>
+        <w:t xml:space="preserve"> — the Gamma infographics render</w:t>
         <w:br/>
         <w:t>a readable "no key" page.</w:t>
       </w:r>
@@ -4271,7 +4183,7 @@
             <w:r/>
             <w:r>
               <w:rPr/>
-              <w:t>8214</w:t>
+              <w:t>8215</w:t>
             </w:r>
           </w:p>
         </w:tc>
@@ -4283,7 +4195,7 @@
             <w:r/>
             <w:r>
               <w:rPr/>
-              <w:t>driver_svc</w:t>
+              <w:t>market_svc</w:t>
             </w:r>
           </w:p>
         </w:tc>
@@ -4310,7 +4222,7 @@
             <w:r/>
             <w:r>
               <w:rPr/>
-              <w:t>8215</w:t>
+              <w:t>8500</w:t>
             </w:r>
           </w:p>
         </w:tc>
@@ -4323,7 +4235,7 @@
             <w:r/>
             <w:r>
               <w:rPr/>
-              <w:t>market_svc</w:t>
+              <w:t>webgui (NiceGUI)</w:t>
             </w:r>
           </w:p>
         </w:tc>
@@ -4350,7 +4262,7 @@
             <w:r/>
             <w:r>
               <w:rPr/>
-              <w:t>8500</w:t>
+              <w:t>8501</w:t>
             </w:r>
           </w:p>
         </w:tc>
@@ -4362,54 +4274,13 @@
             <w:r/>
             <w:r>
               <w:rPr/>
-              <w:t>webgui (NiceGUI)</w:t>
+              <w:t>webgui_live — the PUBLIC read-only screens, a second NiceGUI process</w:t>
             </w:r>
           </w:p>
         </w:tc>
         <w:tc>
           <w:tcPr>
             <w:tcW w:type="dxa" w:w="2880"/>
-          </w:tcPr>
-          <w:p>
-            <w:r/>
-            <w:r>
-              <w:rPr/>
-              <w:t>Required</w:t>
-            </w:r>
-          </w:p>
-        </w:tc>
-      </w:tr>
-      <w:tr>
-        <w:tc>
-          <w:tcPr>
-            <w:tcW w:type="dxa" w:w="2880"/>
-            <w:shd w:val="clear" w:color="auto" w:fill="F4F6FA"/>
-          </w:tcPr>
-          <w:p>
-            <w:r/>
-            <w:r>
-              <w:rPr/>
-              <w:t>8501</w:t>
-            </w:r>
-          </w:p>
-        </w:tc>
-        <w:tc>
-          <w:tcPr>
-            <w:tcW w:type="dxa" w:w="2880"/>
-            <w:shd w:val="clear" w:color="auto" w:fill="F4F6FA"/>
-          </w:tcPr>
-          <w:p>
-            <w:r/>
-            <w:r>
-              <w:rPr/>
-              <w:t>webgui_live — the PUBLIC read-only screens, a second NiceGUI process</w:t>
-            </w:r>
-          </w:p>
-        </w:tc>
-        <w:tc>
-          <w:tcPr>
-            <w:tcW w:type="dxa" w:w="2880"/>
-            <w:shd w:val="clear" w:color="auto" w:fill="F4F6FA"/>
           </w:tcPr>
           <w:p>
             <w:r/>
@@ -4683,54 +4554,6 @@
           </w:p>
         </w:tc>
       </w:tr>
-      <w:tr>
-        <w:tc>
-          <w:tcPr>
-            <w:tcW w:type="dxa" w:w="4320"/>
-          </w:tcPr>
-          <w:p>
-            <w:r/>
-            <w:r>
-              <w:rPr>
-                <w:b/>
-              </w:rPr>
-              <w:t>Driver model override</w:t>
-            </w:r>
-          </w:p>
-        </w:tc>
-        <w:tc>
-          <w:tcPr>
-            <w:tcW w:type="dxa" w:w="4320"/>
-          </w:tcPr>
-          <w:p>
-            <w:r/>
-            <w:r>
-              <w:rPr>
-                <w:rFonts w:ascii="Consolas" w:hAnsi="Consolas"/>
-                <w:color w:val="334455"/>
-                <w:sz w:val="19"/>
-              </w:rPr>
-              <w:t>DRIVER_MODEL</w:t>
-            </w:r>
-            <w:r>
-              <w:rPr/>
-              <w:t xml:space="preserve"> env var → gitignored </w:t>
-            </w:r>
-            <w:r>
-              <w:rPr>
-                <w:rFonts w:ascii="Consolas" w:hAnsi="Consolas"/>
-                <w:color w:val="334455"/>
-                <w:sz w:val="19"/>
-              </w:rPr>
-              <w:t>shared/driver_model.txt</w:t>
-            </w:r>
-            <w:r>
-              <w:rPr/>
-              <w:t xml:space="preserve"> (defaults to the built-in model id).</w:t>
-            </w:r>
-          </w:p>
-        </w:tc>
-      </w:tr>
     </w:tbl>
     <w:p/>
     <w:p>
@@ -4751,7 +4574,7 @@
         <w:rPr>
           <w:b/>
         </w:rPr>
-        <w:t>Redis → schwab-proxy → the six services → webgui.</w:t>
+        <w:t>Redis → schwab-proxy → the five services → webgui.</w:t>
       </w:r>
       <w:r>
         <w:rPr/>
@@ -4858,7 +4681,7 @@
             <w:r/>
             <w:r>
               <w:rPr/>
-              <w:t>Proxy + 6 services + webgui + webgui_live. Also starts at boot.</w:t>
+              <w:t>Proxy + 5 services + webgui + webgui_live. Also starts at boot.</w:t>
             </w:r>
           </w:p>
         </w:tc>
@@ -4890,7 +4713,7 @@
             <w:r/>
             <w:r>
               <w:rPr/>
-              <w:t xml:space="preserve">Stops all ten, the public live screens included. </w:t>
+              <w:t xml:space="preserve">Stops all nine, the public live screens included. </w:t>
             </w:r>
             <w:r>
               <w:rPr>
@@ -5039,7 +4862,7 @@
       </w:pPr>
       <w:r>
         <w:rPr/>
-        <w:t xml:space="preserve">The nine processes must stay </w:t>
+        <w:t xml:space="preserve">The eight processes must stay </w:t>
       </w:r>
       <w:r>
         <w:rPr>
@@ -5131,7 +4954,7 @@
       <w:r>
         <w:t xml:space="preserve"> — the System Status page probes Redis,</w:t>
         <w:br/>
-        <w:t xml:space="preserve">   the proxy, Schwab authorization, all six services, the webgui and the public</w:t>
+        <w:t xml:space="preserve">   the proxy, Schwab authorization, all five services, the webgui and the public</w:t>
         <w:br/>
         <w:t xml:space="preserve">   live screens, plus a data-freshness table.</w:t>
       </w:r>
@@ -5162,7 +4985,18 @@
           <w:color w:val="334455"/>
           <w:sz w:val="19"/>
         </w:rPr>
-        <w:t>GET http://127.0.0.1:82{10..15}/health</w:t>
+        <w:t>GET http://127.0.0.1:82{10..13}/health</w:t>
+      </w:r>
+      <w:r>
+        <w:t xml:space="preserve"> and </w:t>
+      </w:r>
+      <w:r>
+        <w:rPr>
+          <w:rFonts w:ascii="Consolas" w:hAnsi="Consolas"/>
+          <w:color w:val="334455"/>
+          <w:sz w:val="19"/>
+        </w:rPr>
+        <w:t>:8215/health</w:t>
       </w:r>
       <w:r>
         <w:t xml:space="preserve"> (each returns </w:t>
@@ -5485,7 +5319,7 @@
           <w:color w:val="223344"/>
           <w:sz w:val="18"/>
         </w:rPr>
-        <w:t xml:space="preserve">                    trade/driver/market). Each imports only its engines, owns its</w:t>
+        <w:t xml:space="preserve">                    trade/market). Each imports only its engines, owns its</w:t>
       </w:r>
       <w:r>
         <w:br/>
@@ -5844,7 +5678,7 @@
             <w:r/>
             <w:r>
               <w:rPr/>
-              <w:t>driver_svc</w:t>
+              <w:t>market_svc</w:t>
             </w:r>
           </w:p>
         </w:tc>
@@ -5856,7 +5690,7 @@
             <w:r/>
             <w:r>
               <w:rPr/>
-              <w:t>8214</w:t>
+              <w:t>8215</w:t>
             </w:r>
           </w:p>
         </w:tc>
@@ -5868,7 +5702,7 @@
             <w:r/>
             <w:r>
               <w:rPr/>
-              <w:t>Autonomous decision layer (Claude + pure-code guardrails).</w:t>
+              <w:t>Live macro-ticker Market Dashboard (~3 s RTH poll).</w:t>
             </w:r>
           </w:p>
         </w:tc>
@@ -5883,7 +5717,7 @@
             <w:r/>
             <w:r>
               <w:rPr/>
-              <w:t>market_svc</w:t>
+              <w:t>webgui</w:t>
             </w:r>
           </w:p>
         </w:tc>
@@ -5896,7 +5730,7 @@
             <w:r/>
             <w:r>
               <w:rPr/>
-              <w:t>8215</w:t>
+              <w:t>8500</w:t>
             </w:r>
           </w:p>
         </w:tc>
@@ -5909,7 +5743,7 @@
             <w:r/>
             <w:r>
               <w:rPr/>
-              <w:t>Live macro-ticker Market Dashboard (~3 s RTH poll).</w:t>
+              <w:t>The web UI.</w:t>
             </w:r>
           </w:p>
         </w:tc>
@@ -5923,7 +5757,7 @@
             <w:r/>
             <w:r>
               <w:rPr/>
-              <w:t>webgui</w:t>
+              <w:t>webgui_live</w:t>
             </w:r>
           </w:p>
         </w:tc>
@@ -5935,54 +5769,13 @@
             <w:r/>
             <w:r>
               <w:rPr/>
-              <w:t>8500</w:t>
+              <w:t>8501</w:t>
             </w:r>
           </w:p>
         </w:tc>
         <w:tc>
           <w:tcPr>
             <w:tcW w:type="dxa" w:w="2880"/>
-          </w:tcPr>
-          <w:p>
-            <w:r/>
-            <w:r>
-              <w:rPr/>
-              <w:t>The web UI.</w:t>
-            </w:r>
-          </w:p>
-        </w:tc>
-      </w:tr>
-      <w:tr>
-        <w:tc>
-          <w:tcPr>
-            <w:tcW w:type="dxa" w:w="2880"/>
-            <w:shd w:val="clear" w:color="auto" w:fill="F4F6FA"/>
-          </w:tcPr>
-          <w:p>
-            <w:r/>
-            <w:r>
-              <w:rPr/>
-              <w:t>webgui_live</w:t>
-            </w:r>
-          </w:p>
-        </w:tc>
-        <w:tc>
-          <w:tcPr>
-            <w:tcW w:type="dxa" w:w="2880"/>
-            <w:shd w:val="clear" w:color="auto" w:fill="F4F6FA"/>
-          </w:tcPr>
-          <w:p>
-            <w:r/>
-            <w:r>
-              <w:rPr/>
-              <w:t>8501</w:t>
-            </w:r>
-          </w:p>
-        </w:tc>
-        <w:tc>
-          <w:tcPr>
-            <w:tcW w:type="dxa" w:w="2880"/>
-            <w:shd w:val="clear" w:color="auto" w:fill="F4F6FA"/>
           </w:tcPr>
           <w:p>
             <w:r/>
@@ -6073,7 +5866,7 @@
       <w:r>
         <w:rPr/>
         <w:br/>
-        <w:t xml:space="preserve">ports to 9210–9215 and the web GUI to 9500, uses Redis </w:t>
+        <w:t xml:space="preserve">ports to 9210–9213 and 9215 and the web GUI to 9500, uses Redis </w:t>
       </w:r>
       <w:r>
         <w:rPr>
@@ -6126,71 +5919,6 @@
       <w:r>
         <w:rPr/>
         <w:t>.</w:t>
-      </w:r>
-    </w:p>
-    <w:p>
-      <w:pPr>
-        <w:pStyle w:val="IntenseQuote"/>
-      </w:pPr>
-      <w:r>
-        <w:rPr>
-          <w:rFonts w:ascii="Consolas" w:hAnsi="Consolas"/>
-          <w:color w:val="334455"/>
-          <w:sz w:val="19"/>
-        </w:rPr>
-        <w:t>driver_svc</w:t>
-      </w:r>
-      <w:r>
-        <w:rPr>
-          <w:b/>
-        </w:rPr>
-        <w:t xml:space="preserve"> no longer runs a morning order-approval pipeline.</w:t>
-      </w:r>
-      <w:r>
-        <w:rPr/>
-        <w:t xml:space="preserve"> That queue and</w:t>
-        <w:br/>
-        <w:t xml:space="preserve">its </w:t>
-      </w:r>
-      <w:r>
-        <w:rPr>
-          <w:rFonts w:ascii="Consolas" w:hAnsi="Consolas"/>
-          <w:color w:val="334455"/>
-          <w:sz w:val="19"/>
-        </w:rPr>
-        <w:t>claude-driver</w:t>
-      </w:r>
-      <w:r>
-        <w:rPr/>
-        <w:t xml:space="preserve"> engine were removed in July 2026. The service now runs</w:t>
-        <w:br/>
-        <w:t xml:space="preserve">autonomous checkpoints whose output is a command on </w:t>
-      </w:r>
-      <w:r>
-        <w:rPr>
-          <w:rFonts w:ascii="Consolas" w:hAnsi="Consolas"/>
-          <w:color w:val="334455"/>
-          <w:sz w:val="19"/>
-        </w:rPr>
-        <w:t>cmd:options</w:t>
-      </w:r>
-      <w:r>
-        <w:rPr/>
-        <w:t>; the risk</w:t>
-        <w:br/>
-        <w:t xml:space="preserve">clamping is pure code in </w:t>
-      </w:r>
-      <w:r>
-        <w:rPr>
-          <w:rFonts w:ascii="Consolas" w:hAnsi="Consolas"/>
-          <w:color w:val="334455"/>
-          <w:sz w:val="19"/>
-        </w:rPr>
-        <w:t>guardrails.py</w:t>
-      </w:r>
-      <w:r>
-        <w:rPr/>
-        <w:t>, never the model.</w:t>
       </w:r>
     </w:p>
     <w:p>
@@ -6637,7 +6365,7 @@
             <w:r/>
             <w:r>
               <w:rPr/>
-              <w:t>The six Tier-2 domain services.</w:t>
+              <w:t>The five Tier-2 domain services.</w:t>
             </w:r>
           </w:p>
         </w:tc>
@@ -10664,7 +10392,7 @@
         <w:rPr/>
         <w:t xml:space="preserve"> contract,</w:t>
         <w:br/>
-        <w:t xml:space="preserve">the </w:t>
+        <w:t xml:space="preserve">and the </w:t>
       </w:r>
       <w:r>
         <w:rPr>
@@ -10676,7 +10404,7 @@
       </w:r>
       <w:r>
         <w:rPr/>
-        <w:t xml:space="preserve"> DB columns and the driver packet.</w:t>
+        <w:t xml:space="preserve"> DB columns.</w:t>
       </w:r>
     </w:p>
     <w:tbl>
@@ -11041,13 +10769,12 @@
         <w:rPr>
           <w:b/>
         </w:rPr>
-        <w:t>duplicated in four</w:t>
-        <w:br/>
-        <w:t>tiers</w:t>
-      </w:r>
-      <w:r>
-        <w:rPr/>
-        <w:t xml:space="preserve"> (</w:t>
+        <w:t>duplicated</w:t>
+      </w:r>
+      <w:r>
+        <w:rPr/>
+        <w:t xml:space="preserve"> in</w:t>
+        <w:br/>
       </w:r>
       <w:r>
         <w:rPr>
@@ -11059,20 +10786,7 @@
       </w:r>
       <w:r>
         <w:rPr/>
-        <w:t xml:space="preserve">, </w:t>
-      </w:r>
-      <w:r>
-        <w:rPr>
-          <w:rFonts w:ascii="Consolas" w:hAnsi="Consolas"/>
-          <w:color w:val="334455"/>
-          <w:sz w:val="19"/>
-        </w:rPr>
-        <w:t>driver_svc/compute.py</w:t>
-      </w:r>
-      <w:r>
-        <w:rPr/>
-        <w:t>,</w:t>
-        <w:br/>
+        <w:t xml:space="preserve"> and </w:t>
       </w:r>
       <w:r>
         <w:rPr>
@@ -11084,7 +10798,7 @@
       </w:r>
       <w:r>
         <w:rPr/>
-        <w:t>) because none of those may import the package —</w:t>
+        <w:t xml:space="preserve"> because none of those may import the package —</w:t>
         <w:br/>
         <w:t>Tier 1 takes no engine imports, and the services would hit the documented</w:t>
         <w:br/>
@@ -31986,17 +31700,17 @@
               <w:rPr>
                 <w:b/>
               </w:rPr>
-              <w:t>driver</w:t>
-            </w:r>
-            <w:r>
-              <w:rPr/>
-              <w:t xml:space="preserve"> paper auto-manage every </w:t>
+              <w:t>captured-signal</w:t>
+            </w:r>
+            <w:r>
+              <w:rPr/>
+              <w:t xml:space="preserve"> management every </w:t>
             </w:r>
             <w:r>
               <w:rPr>
                 <w:b/>
               </w:rPr>
-              <w:t>1 min</w:t>
+              <w:t>5 min</w:t>
             </w:r>
             <w:r>
               <w:rPr/>
@@ -32008,7 +31722,7 @@
                 <w:color w:val="334455"/>
                 <w:sz w:val="19"/>
               </w:rPr>
-              <w:t>_MANAGE_INTERVAL_MIN</w:t>
+              <w:t>_CAPTURED_MANAGE_INTERVAL_MIN</w:t>
             </w:r>
             <w:r>
               <w:rPr/>
@@ -32018,17 +31732,17 @@
               <w:rPr>
                 <w:b/>
               </w:rPr>
-              <w:t>captured-signal</w:t>
-            </w:r>
-            <w:r>
-              <w:rPr/>
-              <w:t xml:space="preserve"> management every </w:t>
+              <w:t>manual</w:t>
+            </w:r>
+            <w:r>
+              <w:rPr/>
+              <w:t xml:space="preserve"> paper entry+manage </w:t>
             </w:r>
             <w:r>
               <w:rPr>
                 <w:b/>
               </w:rPr>
-              <w:t>5 min</w:t>
+              <w:t>hourly at the top of the hour, 09:00–14:00, no 15:00 run</w:t>
             </w:r>
             <w:r>
               <w:rPr/>
@@ -32040,31 +31754,11 @@
                 <w:color w:val="334455"/>
                 <w:sz w:val="19"/>
               </w:rPr>
-              <w:t>_CAPTURED_MANAGE_INTERVAL_MIN</w:t>
-            </w:r>
-            <w:r>
-              <w:rPr/>
-              <w:t xml:space="preserve">); </w:t>
-            </w:r>
-            <w:r>
-              <w:rPr>
-                <w:b/>
-              </w:rPr>
-              <w:t>manual</w:t>
-            </w:r>
-            <w:r>
-              <w:rPr/>
-              <w:t xml:space="preserve"> paper entry+manage </w:t>
-            </w:r>
-            <w:r>
-              <w:rPr>
-                <w:b/>
-              </w:rPr>
-              <w:t>hourly at the top of the hour, 09:00–14:00, no 15:00 run</w:t>
-            </w:r>
-            <w:r>
-              <w:rPr/>
-              <w:t xml:space="preserve"> (</w:t>
+              <w:t>_PAPER_HOURS</w:t>
+            </w:r>
+            <w:r>
+              <w:rPr/>
+              <w:t xml:space="preserve">, </w:t>
             </w:r>
             <w:r>
               <w:rPr>
@@ -32072,11 +31766,21 @@
                 <w:color w:val="334455"/>
                 <w:sz w:val="19"/>
               </w:rPr>
-              <w:t>_PAPER_HOURS</w:t>
-            </w:r>
-            <w:r>
-              <w:rPr/>
-              <w:t xml:space="preserve">, </w:t>
+              <w:t>_PAPER_GRACE_MIN</w:t>
+            </w:r>
+            <w:r>
+              <w:rPr/>
+              <w:t xml:space="preserve"> = 20); header + GEX status each tick in market hours, throttled to one per </w:t>
+            </w:r>
+            <w:r>
+              <w:rPr>
+                <w:b/>
+              </w:rPr>
+              <w:t>5 min</w:t>
+            </w:r>
+            <w:r>
+              <w:rPr/>
+              <w:t xml:space="preserve"> off-hours (</w:t>
             </w:r>
             <w:r>
               <w:rPr>
@@ -32084,21 +31788,47 @@
                 <w:color w:val="334455"/>
                 <w:sz w:val="19"/>
               </w:rPr>
-              <w:t>_PAPER_GRACE_MIN</w:t>
-            </w:r>
-            <w:r>
-              <w:rPr/>
-              <w:t xml:space="preserve"> = 20); header + GEX status each tick in market hours, throttled to one per </w:t>
+              <w:t>periodic_refresh_due</w:t>
+            </w:r>
+            <w:r>
+              <w:rPr/>
+              <w:t>, skip-unchanged).</w:t>
+            </w:r>
+          </w:p>
+        </w:tc>
+      </w:tr>
+      <w:tr>
+        <w:tc>
+          <w:tcPr>
+            <w:tcW w:type="dxa" w:w="4320"/>
+          </w:tcPr>
+          <w:p>
+            <w:r/>
+            <w:r>
+              <w:rPr/>
+              <w:t>portfolio_svc</w:t>
+            </w:r>
+          </w:p>
+        </w:tc>
+        <w:tc>
+          <w:tcPr>
+            <w:tcW w:type="dxa" w:w="4320"/>
+          </w:tcPr>
+          <w:p>
+            <w:r/>
+            <w:r>
+              <w:rPr/>
+              <w:t xml:space="preserve">Live SSE ticks; throttled publish ≤ every </w:t>
             </w:r>
             <w:r>
               <w:rPr>
                 <w:b/>
               </w:rPr>
-              <w:t>5 min</w:t>
-            </w:r>
-            <w:r>
-              <w:rPr/>
-              <w:t xml:space="preserve"> off-hours (</w:t>
+              <w:t>2 s</w:t>
+            </w:r>
+            <w:r>
+              <w:rPr/>
+              <w:t xml:space="preserve"> (</w:t>
             </w:r>
             <w:r>
               <w:rPr>
@@ -32106,43 +31836,17 @@
                 <w:color w:val="334455"/>
                 <w:sz w:val="19"/>
               </w:rPr>
-              <w:t>periodic_refresh_due</w:t>
-            </w:r>
-            <w:r>
-              <w:rPr/>
-              <w:t>, skip-unchanged).</w:t>
-            </w:r>
-          </w:p>
-        </w:tc>
-      </w:tr>
-      <w:tr>
-        <w:tc>
-          <w:tcPr>
-            <w:tcW w:type="dxa" w:w="4320"/>
-          </w:tcPr>
-          <w:p>
-            <w:r/>
-            <w:r>
-              <w:rPr/>
-              <w:t>portfolio_svc</w:t>
-            </w:r>
-          </w:p>
-        </w:tc>
-        <w:tc>
-          <w:tcPr>
-            <w:tcW w:type="dxa" w:w="4320"/>
-          </w:tcPr>
-          <w:p>
-            <w:r/>
-            <w:r>
-              <w:rPr/>
-              <w:t xml:space="preserve">Live SSE ticks; throttled publish ≤ every </w:t>
+              <w:t>PUBLISH_INTERVAL_SEC</w:t>
+            </w:r>
+            <w:r>
+              <w:rPr/>
+              <w:t xml:space="preserve">); full rebuild every </w:t>
             </w:r>
             <w:r>
               <w:rPr>
                 <w:b/>
               </w:rPr>
-              <w:t>2 s</w:t>
+              <w:t>600 s</w:t>
             </w:r>
             <w:r>
               <w:rPr/>
@@ -32154,21 +31858,21 @@
                 <w:color w:val="334455"/>
                 <w:sz w:val="19"/>
               </w:rPr>
-              <w:t>PUBLISH_INTERVAL_SEC</w:t>
-            </w:r>
-            <w:r>
-              <w:rPr/>
-              <w:t xml:space="preserve">); full rebuild every </w:t>
+              <w:t>REBUILD_INTERVAL_SEC</w:t>
+            </w:r>
+            <w:r>
+              <w:rPr/>
+              <w:t xml:space="preserve">), or </w:t>
             </w:r>
             <w:r>
               <w:rPr>
                 <w:b/>
               </w:rPr>
-              <w:t>600 s</w:t>
-            </w:r>
-            <w:r>
-              <w:rPr/>
-              <w:t xml:space="preserve"> (</w:t>
+              <w:t>3600 s</w:t>
+            </w:r>
+            <w:r>
+              <w:rPr/>
+              <w:t xml:space="preserve"> off-hours (</w:t>
             </w:r>
             <w:r>
               <w:rPr>
@@ -32176,28 +31880,6 @@
                 <w:color w:val="334455"/>
                 <w:sz w:val="19"/>
               </w:rPr>
-              <w:t>REBUILD_INTERVAL_SEC</w:t>
-            </w:r>
-            <w:r>
-              <w:rPr/>
-              <w:t xml:space="preserve">), or </w:t>
-            </w:r>
-            <w:r>
-              <w:rPr>
-                <w:b/>
-              </w:rPr>
-              <w:t>3600 s</w:t>
-            </w:r>
-            <w:r>
-              <w:rPr/>
-              <w:t xml:space="preserve"> off-hours (</w:t>
-            </w:r>
-            <w:r>
-              <w:rPr>
-                <w:rFonts w:ascii="Consolas" w:hAnsi="Consolas"/>
-                <w:color w:val="334455"/>
-                <w:sz w:val="19"/>
-              </w:rPr>
               <w:t>OFFHOURS_REBUILD_INTERVAL_SEC</w:t>
             </w:r>
             <w:r>
@@ -32244,119 +31926,13 @@
             <w:r/>
             <w:r>
               <w:rPr/>
-              <w:t>driver_svc</w:t>
+              <w:t>market_svc</w:t>
             </w:r>
           </w:p>
         </w:tc>
         <w:tc>
           <w:tcPr>
             <w:tcW w:type="dxa" w:w="4320"/>
-          </w:tcPr>
-          <w:p>
-            <w:r/>
-            <w:r>
-              <w:rPr/>
-              <w:t xml:space="preserve">Run gate polled every </w:t>
-            </w:r>
-            <w:r>
-              <w:rPr>
-                <w:b/>
-              </w:rPr>
-              <w:t>30 s</w:t>
-            </w:r>
-            <w:r>
-              <w:rPr/>
-              <w:t xml:space="preserve"> (</w:t>
-            </w:r>
-            <w:r>
-              <w:rPr>
-                <w:rFonts w:ascii="Consolas" w:hAnsi="Consolas"/>
-                <w:color w:val="334455"/>
-                <w:sz w:val="19"/>
-              </w:rPr>
-              <w:t>POLL_INTERVAL_SEC</w:t>
-            </w:r>
-            <w:r>
-              <w:rPr/>
-              <w:t xml:space="preserve">); checkpoints every </w:t>
-            </w:r>
-            <w:r>
-              <w:rPr>
-                <w:b/>
-              </w:rPr>
-              <w:t>30 min</w:t>
-            </w:r>
-            <w:r>
-              <w:rPr/>
-              <w:t xml:space="preserve"> (</w:t>
-            </w:r>
-            <w:r>
-              <w:rPr>
-                <w:rFonts w:ascii="Consolas" w:hAnsi="Consolas"/>
-                <w:color w:val="334455"/>
-                <w:sz w:val="19"/>
-              </w:rPr>
-              <w:t>CHECKPOINT_MIN</w:t>
-            </w:r>
-            <w:r>
-              <w:rPr/>
-              <w:t xml:space="preserve">, from </w:t>
-            </w:r>
-            <w:r>
-              <w:rPr>
-                <w:rFonts w:ascii="Consolas" w:hAnsi="Consolas"/>
-                <w:color w:val="334455"/>
-                <w:sz w:val="19"/>
-              </w:rPr>
-              <w:t>config/driver.toml</w:t>
-            </w:r>
-            <w:r>
-              <w:rPr/>
-              <w:t xml:space="preserve">) inside the </w:t>
-            </w:r>
-            <w:r>
-              <w:rPr>
-                <w:b/>
-              </w:rPr>
-              <w:t>09:45–15:30 ET</w:t>
-            </w:r>
-            <w:r>
-              <w:rPr/>
-              <w:t xml:space="preserve"> entry window (</w:t>
-            </w:r>
-            <w:r>
-              <w:rPr>
-                <w:rFonts w:ascii="Consolas" w:hAnsi="Consolas"/>
-                <w:color w:val="334455"/>
-                <w:sz w:val="19"/>
-              </w:rPr>
-              <w:t>checkpoint_due</w:t>
-            </w:r>
-            <w:r>
-              <w:rPr/>
-              <w:t>) — the open-bell slot is deliberately skipped, so the first fire-able slot is 09:45 and the last entry decision is the 15:00 slot.</w:t>
-            </w:r>
-          </w:p>
-        </w:tc>
-      </w:tr>
-      <w:tr>
-        <w:tc>
-          <w:tcPr>
-            <w:tcW w:type="dxa" w:w="4320"/>
-            <w:shd w:val="clear" w:color="auto" w:fill="F4F6FA"/>
-          </w:tcPr>
-          <w:p>
-            <w:r/>
-            <w:r>
-              <w:rPr/>
-              <w:t>market_svc</w:t>
-            </w:r>
-          </w:p>
-        </w:tc>
-        <w:tc>
-          <w:tcPr>
-            <w:tcW w:type="dxa" w:w="4320"/>
-            <w:shd w:val="clear" w:color="auto" w:fill="F4F6FA"/>
           </w:tcPr>
           <w:p>
             <w:r/>
@@ -32841,68 +32417,6 @@
       </w:tr>
     </w:tbl>
     <w:p/>
-    <w:p>
-      <w:pPr>
-        <w:pStyle w:val="IntenseQuote"/>
-      </w:pPr>
-      <w:r>
-        <w:rPr>
-          <w:b/>
-        </w:rPr>
-        <w:t>Two cadences are easy to state wrongly, because they used to be the same</w:t>
-        <w:br/>
-        <w:t>number.</w:t>
-      </w:r>
-      <w:r>
-        <w:rPr/>
-        <w:t xml:space="preserve"> The </w:t>
-      </w:r>
-      <w:r>
-        <w:rPr>
-          <w:b/>
-        </w:rPr>
-        <w:t>driver's</w:t>
-      </w:r>
-      <w:r>
-        <w:rPr/>
-        <w:t xml:space="preserve"> isolated paper account re-prices every </w:t>
-      </w:r>
-      <w:r>
-        <w:rPr>
-          <w:b/>
-        </w:rPr>
-        <w:t>1 minute</w:t>
-      </w:r>
-      <w:r>
-        <w:rPr/>
-        <w:br/>
-        <w:t>(raised from 5 in July 2026 so its stops react within the minute and the −$1,500</w:t>
-        <w:br/>
-        <w:t xml:space="preserve">loss-halt read stays fresh). The </w:t>
-      </w:r>
-      <w:r>
-        <w:rPr>
-          <w:b/>
-        </w:rPr>
-        <w:t>manual</w:t>
-      </w:r>
-      <w:r>
-        <w:rPr/>
-        <w:t xml:space="preserve"> paper account moved the other way, to</w:t>
-        <w:br/>
-        <w:t xml:space="preserve">an </w:t>
-      </w:r>
-      <w:r>
-        <w:rPr>
-          <w:b/>
-        </w:rPr>
-        <w:t>hourly</w:t>
-      </w:r>
-      <w:r>
-        <w:rPr/>
-        <w:t xml:space="preserve"> top-of-the-hour cycle. They are different books on different clocks.</w:t>
-      </w:r>
-    </w:p>
     <w:p>
       <w:pPr>
         <w:pStyle w:val="IntenseQuote"/>

</xml_diff>

<commit_message>
docs(news): routes, changelog, manuals and the CLAUDE.md invariants
Co-Authored-By: Claude Opus 5.5 <noreply@anthropic.com>
Claude-Session: https://claude.ai/code/session_014N2du2DmXUxAruBTFwyyAD
</commit_message>
<xml_diff>
--- a/docs/manuals/technical-reference/technical-reference.docx
+++ b/docs/manuals/technical-reference/technical-reference.docx
@@ -32,7 +32,7 @@
           <w:color w:val="5B6678"/>
           <w:sz w:val="18"/>
         </w:rPr>
-        <w:t>NeuralStrike · Generated 2026-09-22</w:t>
+        <w:t>NeuralStrike · Generated 2026-09-26</w:t>
       </w:r>
     </w:p>
     <w:p/>
@@ -1218,7 +1218,7 @@
             </w:r>
             <w:r>
               <w:rPr/>
-              <w:t xml:space="preserve"> The stack runs as nine </w:t>
+              <w:t xml:space="preserve"> The stack runs as ten </w:t>
             </w:r>
             <w:r>
               <w:rPr>
@@ -1950,7 +1950,7 @@
             <w:r/>
             <w:r>
               <w:rPr/>
-              <w:t>The proxy + the five domain services.</w:t>
+              <w:t>The proxy + the six domain services.</w:t>
             </w:r>
           </w:p>
         </w:tc>
@@ -2214,62 +2214,62 @@
                 <w:color w:val="334455"/>
                 <w:sz w:val="19"/>
               </w:rPr>
-              <w:t>anthropic==0.112.0</w:t>
-            </w:r>
-          </w:p>
-        </w:tc>
-        <w:tc>
-          <w:tcPr>
-            <w:tcW w:type="dxa" w:w="4320"/>
-          </w:tcPr>
-          <w:p>
-            <w:r/>
-            <w:r>
-              <w:rPr/>
-              <w:t>Claude tool-use calls (imported lazily — the suite runs without it configured).</w:t>
-            </w:r>
-          </w:p>
-        </w:tc>
-      </w:tr>
-      <w:tr>
-        <w:tc>
-          <w:tcPr>
-            <w:tcW w:type="dxa" w:w="4320"/>
-            <w:shd w:val="clear" w:color="auto" w:fill="F4F6FA"/>
-          </w:tcPr>
-          <w:p>
-            <w:r/>
+              <w:t>feedparser==6.0.11</w:t>
+            </w:r>
+            <w:r>
+              <w:rPr/>
+              <w:t xml:space="preserve"> (+ </w:t>
+            </w:r>
             <w:r>
               <w:rPr>
                 <w:rFonts w:ascii="Consolas" w:hAnsi="Consolas"/>
                 <w:color w:val="334455"/>
                 <w:sz w:val="19"/>
               </w:rPr>
-              <w:t>matplotlib</w:t>
-            </w:r>
-            <w:r>
-              <w:rPr/>
-              <w:t xml:space="preserve">, </w:t>
-            </w:r>
+              <w:t>sgmllib3k</w:t>
+            </w:r>
+            <w:r>
+              <w:rPr/>
+              <w:t>)</w:t>
+            </w:r>
+          </w:p>
+        </w:tc>
+        <w:tc>
+          <w:tcPr>
+            <w:tcW w:type="dxa" w:w="4320"/>
+          </w:tcPr>
+          <w:p>
+            <w:r/>
             <w:r>
               <w:rPr>
                 <w:rFonts w:ascii="Consolas" w:hAnsi="Consolas"/>
                 <w:color w:val="334455"/>
                 <w:sz w:val="19"/>
               </w:rPr>
-              <w:t>Pillow</w:t>
-            </w:r>
-            <w:r>
-              <w:rPr/>
-              <w:t xml:space="preserve">, </w:t>
-            </w:r>
+              <w:t>news_svc</w:t>
+            </w:r>
+            <w:r>
+              <w:rPr/>
+              <w:t xml:space="preserve"> parses the public RSS / Atom feeds it polls.</w:t>
+            </w:r>
+          </w:p>
+        </w:tc>
+      </w:tr>
+      <w:tr>
+        <w:tc>
+          <w:tcPr>
+            <w:tcW w:type="dxa" w:w="4320"/>
+            <w:shd w:val="clear" w:color="auto" w:fill="F4F6FA"/>
+          </w:tcPr>
+          <w:p>
+            <w:r/>
             <w:r>
               <w:rPr>
                 <w:rFonts w:ascii="Consolas" w:hAnsi="Consolas"/>
                 <w:color w:val="334455"/>
                 <w:sz w:val="19"/>
               </w:rPr>
-              <w:t>yfinance</w:t>
+              <w:t>anthropic==0.112.0</w:t>
             </w:r>
           </w:p>
         </w:tc>
@@ -2277,6 +2277,60 @@
           <w:tcPr>
             <w:tcW w:type="dxa" w:w="4320"/>
             <w:shd w:val="clear" w:color="auto" w:fill="F4F6FA"/>
+          </w:tcPr>
+          <w:p>
+            <w:r/>
+            <w:r>
+              <w:rPr/>
+              <w:t>Claude tool-use calls (imported lazily — the suite runs without it configured).</w:t>
+            </w:r>
+          </w:p>
+        </w:tc>
+      </w:tr>
+      <w:tr>
+        <w:tc>
+          <w:tcPr>
+            <w:tcW w:type="dxa" w:w="4320"/>
+          </w:tcPr>
+          <w:p>
+            <w:r/>
+            <w:r>
+              <w:rPr>
+                <w:rFonts w:ascii="Consolas" w:hAnsi="Consolas"/>
+                <w:color w:val="334455"/>
+                <w:sz w:val="19"/>
+              </w:rPr>
+              <w:t>matplotlib</w:t>
+            </w:r>
+            <w:r>
+              <w:rPr/>
+              <w:t xml:space="preserve">, </w:t>
+            </w:r>
+            <w:r>
+              <w:rPr>
+                <w:rFonts w:ascii="Consolas" w:hAnsi="Consolas"/>
+                <w:color w:val="334455"/>
+                <w:sz w:val="19"/>
+              </w:rPr>
+              <w:t>Pillow</w:t>
+            </w:r>
+            <w:r>
+              <w:rPr/>
+              <w:t xml:space="preserve">, </w:t>
+            </w:r>
+            <w:r>
+              <w:rPr>
+                <w:rFonts w:ascii="Consolas" w:hAnsi="Consolas"/>
+                <w:color w:val="334455"/>
+                <w:sz w:val="19"/>
+              </w:rPr>
+              <w:t>yfinance</w:t>
+            </w:r>
+          </w:p>
+        </w:tc>
+        <w:tc>
+          <w:tcPr>
+            <w:tcW w:type="dxa" w:w="4320"/>
           </w:tcPr>
           <w:p>
             <w:r/>
@@ -2473,7 +2527,7 @@
               <w:rPr>
                 <w:b/>
               </w:rPr>
-              <w:t>without it none of the five services can publish and every page shows a "Waiting for … service" placeholder.</w:t>
+              <w:t>without it none of the six services can publish and every page shows a "Waiting for … service" placeholder.</w:t>
             </w:r>
             <w:r>
               <w:rPr/>
@@ -4222,7 +4276,7 @@
             <w:r/>
             <w:r>
               <w:rPr/>
-              <w:t>8500</w:t>
+              <w:t>8216</w:t>
             </w:r>
           </w:p>
         </w:tc>
@@ -4235,7 +4289,7 @@
             <w:r/>
             <w:r>
               <w:rPr/>
-              <w:t>webgui (NiceGUI)</w:t>
+              <w:t>news_svc</w:t>
             </w:r>
           </w:p>
         </w:tc>
@@ -4262,6 +4316,45 @@
             <w:r/>
             <w:r>
               <w:rPr/>
+              <w:t>8500</w:t>
+            </w:r>
+          </w:p>
+        </w:tc>
+        <w:tc>
+          <w:tcPr>
+            <w:tcW w:type="dxa" w:w="2880"/>
+          </w:tcPr>
+          <w:p>
+            <w:r/>
+            <w:r>
+              <w:rPr/>
+              <w:t>webgui (NiceGUI)</w:t>
+            </w:r>
+          </w:p>
+        </w:tc>
+        <w:tc>
+          <w:tcPr>
+            <w:tcW w:type="dxa" w:w="2880"/>
+          </w:tcPr>
+          <w:p>
+            <w:r/>
+            <w:r>
+              <w:rPr/>
+              <w:t>Required</w:t>
+            </w:r>
+          </w:p>
+        </w:tc>
+      </w:tr>
+      <w:tr>
+        <w:tc>
+          <w:tcPr>
+            <w:tcW w:type="dxa" w:w="2880"/>
+            <w:shd w:val="clear" w:color="auto" w:fill="F4F6FA"/>
+          </w:tcPr>
+          <w:p>
+            <w:r/>
+            <w:r>
+              <w:rPr/>
               <w:t>8501</w:t>
             </w:r>
           </w:p>
@@ -4269,6 +4362,7 @@
         <w:tc>
           <w:tcPr>
             <w:tcW w:type="dxa" w:w="2880"/>
+            <w:shd w:val="clear" w:color="auto" w:fill="F4F6FA"/>
           </w:tcPr>
           <w:p>
             <w:r/>
@@ -4281,6 +4375,7 @@
         <w:tc>
           <w:tcPr>
             <w:tcW w:type="dxa" w:w="2880"/>
+            <w:shd w:val="clear" w:color="auto" w:fill="F4F6FA"/>
           </w:tcPr>
           <w:p>
             <w:r/>
@@ -4574,12 +4669,25 @@
         <w:rPr>
           <w:b/>
         </w:rPr>
-        <w:t>Redis → schwab-proxy → the five services → webgui.</w:t>
-      </w:r>
-      <w:r>
-        <w:rPr/>
-        <w:br/>
-        <w:t>Services wait on the proxy because every one of them resolves market data through it.</w:t>
+        <w:t>Redis → schwab-proxy → the six services → webgui.</w:t>
+      </w:r>
+      <w:r>
+        <w:rPr/>
+        <w:br/>
+        <w:t>Services wait on the proxy because they resolve market data through it (</w:t>
+      </w:r>
+      <w:r>
+        <w:rPr>
+          <w:rFonts w:ascii="Consolas" w:hAnsi="Consolas"/>
+          <w:color w:val="334455"/>
+          <w:sz w:val="19"/>
+        </w:rPr>
+        <w:t>news_svc</w:t>
+      </w:r>
+      <w:r>
+        <w:rPr/>
+        <w:br/>
+        <w:t>calls no proxy — it reads public feeds — but is ordered with the others).</w:t>
         <w:br/>
       </w:r>
       <w:r>
@@ -4681,7 +4789,7 @@
             <w:r/>
             <w:r>
               <w:rPr/>
-              <w:t>Proxy + 5 services + webgui + webgui_live. Also starts at boot.</w:t>
+              <w:t>Proxy + 6 services + webgui + webgui_live. Also starts at boot.</w:t>
             </w:r>
           </w:p>
         </w:tc>
@@ -4713,7 +4821,7 @@
             <w:r/>
             <w:r>
               <w:rPr/>
-              <w:t xml:space="preserve">Stops all nine, the public live screens included. </w:t>
+              <w:t xml:space="preserve">Stops all ten, the public live screens included. </w:t>
             </w:r>
             <w:r>
               <w:rPr>
@@ -4862,7 +4970,7 @@
       </w:pPr>
       <w:r>
         <w:rPr/>
-        <w:t xml:space="preserve">The eight processes must stay </w:t>
+        <w:t xml:space="preserve">The nine processes must stay </w:t>
       </w:r>
       <w:r>
         <w:rPr>
@@ -4954,7 +5062,7 @@
       <w:r>
         <w:t xml:space="preserve"> — the System Status page probes Redis,</w:t>
         <w:br/>
-        <w:t xml:space="preserve">   the proxy, Schwab authorization, all five services, the webgui and the public</w:t>
+        <w:t xml:space="preserve">   the proxy, Schwab authorization, all six services, the webgui and the public</w:t>
         <w:br/>
         <w:t xml:space="preserve">   live screens, plus a data-freshness table.</w:t>
       </w:r>
@@ -4988,6 +5096,17 @@
         <w:t>GET http://127.0.0.1:82{10..13}/health</w:t>
       </w:r>
       <w:r>
+        <w:t xml:space="preserve">, </w:t>
+      </w:r>
+      <w:r>
+        <w:rPr>
+          <w:rFonts w:ascii="Consolas" w:hAnsi="Consolas"/>
+          <w:color w:val="334455"/>
+          <w:sz w:val="19"/>
+        </w:rPr>
+        <w:t>:8215/health</w:t>
+      </w:r>
+      <w:r>
         <w:t xml:space="preserve"> and </w:t>
       </w:r>
       <w:r>
@@ -4996,7 +5115,7 @@
           <w:color w:val="334455"/>
           <w:sz w:val="19"/>
         </w:rPr>
-        <w:t>:8215/health</w:t>
+        <w:t>:8216/health</w:t>
       </w:r>
       <w:r>
         <w:t xml:space="preserve"> (each returns </w:t>
@@ -5717,7 +5836,7 @@
             <w:r/>
             <w:r>
               <w:rPr/>
-              <w:t>webgui</w:t>
+              <w:t>news_svc</w:t>
             </w:r>
           </w:p>
         </w:tc>
@@ -5730,7 +5849,7 @@
             <w:r/>
             <w:r>
               <w:rPr/>
-              <w:t>8500</w:t>
+              <w:t>8216</w:t>
             </w:r>
           </w:p>
         </w:tc>
@@ -5743,7 +5862,19 @@
             <w:r/>
             <w:r>
               <w:rPr/>
-              <w:t>The web UI.</w:t>
+              <w:t xml:space="preserve">Market News: polls free public RSS / Google News / Yahoo / SEC EDGAR feeds into </w:t>
+            </w:r>
+            <w:r>
+              <w:rPr>
+                <w:rFonts w:ascii="Consolas" w:hAnsi="Consolas"/>
+                <w:color w:val="334455"/>
+                <w:sz w:val="19"/>
+              </w:rPr>
+              <w:t>news.db</w:t>
+            </w:r>
+            <w:r>
+              <w:rPr/>
+              <w:t>. No Schwab, no Claude.</w:t>
             </w:r>
           </w:p>
         </w:tc>
@@ -5757,6 +5888,45 @@
             <w:r/>
             <w:r>
               <w:rPr/>
+              <w:t>webgui</w:t>
+            </w:r>
+          </w:p>
+        </w:tc>
+        <w:tc>
+          <w:tcPr>
+            <w:tcW w:type="dxa" w:w="2880"/>
+          </w:tcPr>
+          <w:p>
+            <w:r/>
+            <w:r>
+              <w:rPr/>
+              <w:t>8500</w:t>
+            </w:r>
+          </w:p>
+        </w:tc>
+        <w:tc>
+          <w:tcPr>
+            <w:tcW w:type="dxa" w:w="2880"/>
+          </w:tcPr>
+          <w:p>
+            <w:r/>
+            <w:r>
+              <w:rPr/>
+              <w:t>The web UI.</w:t>
+            </w:r>
+          </w:p>
+        </w:tc>
+      </w:tr>
+      <w:tr>
+        <w:tc>
+          <w:tcPr>
+            <w:tcW w:type="dxa" w:w="2880"/>
+            <w:shd w:val="clear" w:color="auto" w:fill="F4F6FA"/>
+          </w:tcPr>
+          <w:p>
+            <w:r/>
+            <w:r>
+              <w:rPr/>
               <w:t>webgui_live</w:t>
             </w:r>
           </w:p>
@@ -5764,6 +5934,7 @@
         <w:tc>
           <w:tcPr>
             <w:tcW w:type="dxa" w:w="2880"/>
+            <w:shd w:val="clear" w:color="auto" w:fill="F4F6FA"/>
           </w:tcPr>
           <w:p>
             <w:r/>
@@ -5776,12 +5947,13 @@
         <w:tc>
           <w:tcPr>
             <w:tcW w:type="dxa" w:w="2880"/>
-          </w:tcPr>
-          <w:p>
-            <w:r/>
-            <w:r>
-              <w:rPr/>
-              <w:t>The twenty-one public screens, on their own origin.</w:t>
+            <w:shd w:val="clear" w:color="auto" w:fill="F4F6FA"/>
+          </w:tcPr>
+          <w:p>
+            <w:r/>
+            <w:r>
+              <w:rPr/>
+              <w:t>The seventeen public screens, on their own origin.</w:t>
             </w:r>
           </w:p>
         </w:tc>
@@ -5866,7 +6038,7 @@
       <w:r>
         <w:rPr/>
         <w:br/>
-        <w:t xml:space="preserve">ports to 9210–9213 and 9215 and the web GUI to 9500, uses Redis </w:t>
+        <w:t xml:space="preserve">ports to 9210–9213, 9215 and 9216 and the web GUI to 9500, uses Redis </w:t>
       </w:r>
       <w:r>
         <w:rPr>
@@ -6365,7 +6537,7 @@
             <w:r/>
             <w:r>
               <w:rPr/>
-              <w:t>The five Tier-2 domain services.</w:t>
+              <w:t>The six Tier-2 domain services.</w:t>
             </w:r>
           </w:p>
         </w:tc>
@@ -29853,15 +30025,34 @@
       </w:pPr>
       <w:r>
         <w:rPr/>
-        <w:t>Known issues</w:t>
+        <w:t>Market News</w:t>
       </w:r>
     </w:p>
     <w:p>
       <w:r>
-        <w:rPr/>
-        <w:t>Documented defects a maintainer should know about before trusting a number. These</w:t>
-        <w:br/>
-        <w:t>are recorded rather than silently carried.</w:t>
+        <w:rPr>
+          <w:rFonts w:ascii="Consolas" w:hAnsi="Consolas"/>
+          <w:color w:val="334455"/>
+          <w:sz w:val="19"/>
+        </w:rPr>
+        <w:t>services/news_svc</w:t>
+      </w:r>
+      <w:r>
+        <w:rPr/>
+        <w:t xml:space="preserve"> — the one service with no Schwab or Claude call. Design:</w:t>
+        <w:br/>
+      </w:r>
+      <w:r>
+        <w:rPr>
+          <w:rFonts w:ascii="Consolas" w:hAnsi="Consolas"/>
+          <w:color w:val="334455"/>
+          <w:sz w:val="19"/>
+        </w:rPr>
+        <w:t>docs/plans/2026-09-25-news-feed-design.md</w:t>
+      </w:r>
+      <w:r>
+        <w:rPr/>
+        <w:t>.</w:t>
       </w:r>
     </w:p>
     <w:p>
@@ -29870,321 +30061,53 @@
       </w:pPr>
       <w:r>
         <w:rPr/>
-        <w:t>The PRICE sub-score NaN exposure (open)</w:t>
+        <w:t>Sources</w:t>
       </w:r>
     </w:p>
     <w:p>
       <w:r>
-        <w:rPr>
-          <w:rFonts w:ascii="Consolas" w:hAnsi="Consolas"/>
-          <w:color w:val="334455"/>
-          <w:sz w:val="19"/>
-        </w:rPr>
-        <w:t>sentiment_svc/compute._finite_pcts</w:t>
-      </w:r>
-      <w:r>
-        <w:rPr/>
-        <w:t xml:space="preserve"> guards only the </w:t>
-      </w:r>
-      <w:r>
-        <w:rPr>
-          <w:b/>
-        </w:rPr>
-        <w:t>sector</w:t>
-      </w:r>
-      <w:r>
-        <w:rPr/>
-        <w:t xml:space="preserve"> input. An all-NaN</w:t>
-        <w:br/>
-        <w:t>read of the structural price inputs (</w:t>
-      </w:r>
-      <w:r>
-        <w:rPr>
-          <w:rFonts w:ascii="Consolas" w:hAnsi="Consolas"/>
-          <w:color w:val="334455"/>
-          <w:sz w:val="19"/>
-        </w:rPr>
-        <w:t>macd_hist</w:t>
-      </w:r>
-      <w:r>
-        <w:rPr/>
-        <w:t xml:space="preserve"> / </w:t>
-      </w:r>
-      <w:r>
-        <w:rPr>
-          <w:rFonts w:ascii="Consolas" w:hAnsi="Consolas"/>
-          <w:color w:val="334455"/>
-          <w:sz w:val="19"/>
-        </w:rPr>
-        <w:t>rsi</w:t>
-      </w:r>
-      <w:r>
-        <w:rPr/>
-        <w:t xml:space="preserve"> / </w:t>
-      </w:r>
-      <w:r>
-        <w:rPr>
-          <w:rFonts w:ascii="Consolas" w:hAnsi="Consolas"/>
-          <w:color w:val="334455"/>
-          <w:sz w:val="19"/>
-        </w:rPr>
-        <w:t>adx</w:t>
-      </w:r>
-      <w:r>
-        <w:rPr/>
-        <w:t>, feeding</w:t>
-        <w:br/>
-      </w:r>
-      <w:r>
-        <w:rPr>
-          <w:rFonts w:ascii="Consolas" w:hAnsi="Consolas"/>
-          <w:color w:val="334455"/>
-          <w:sz w:val="19"/>
-        </w:rPr>
-        <w:t>score_price</w:t>
-      </w:r>
-      <w:r>
-        <w:rPr/>
-        <w:t xml:space="preserve"> with a hardcoded </w:t>
-      </w:r>
-      <w:r>
-        <w:rPr>
-          <w:rFonts w:ascii="Consolas" w:hAnsi="Consolas"/>
-          <w:color w:val="334455"/>
-          <w:sz w:val="19"/>
-        </w:rPr>
-        <w:t>vwap_pct = 0.0</w:t>
-      </w:r>
-      <w:r>
-        <w:rPr/>
-        <w:t xml:space="preserve">) scores </w:t>
-      </w:r>
-      <w:r>
-        <w:rPr>
-          <w:b/>
-        </w:rPr>
-        <w:t>82.50 — near-maximum</w:t>
-        <w:br/>
-        <w:t>bullish — at unchanged confidence</w:t>
-      </w:r>
-      <w:r>
-        <w:rPr/>
-        <w:t>, where a sane read of the same tape scores</w:t>
-        <w:br/>
-      </w:r>
-      <w:r>
-        <w:rPr>
-          <w:b/>
-        </w:rPr>
-        <w:t>56.25</w:t>
-      </w:r>
-      <w:r>
-        <w:rPr/>
-        <w:t xml:space="preserve">. The same all-NaN read in </w:t>
-      </w:r>
-      <w:r>
-        <w:rPr>
-          <w:rFonts w:ascii="Consolas" w:hAnsi="Consolas"/>
-          <w:color w:val="334455"/>
-          <w:sz w:val="19"/>
-        </w:rPr>
-        <w:t>compute_intraday_trend</w:t>
-      </w:r>
-      <w:r>
-        <w:rPr/>
-        <w:t>, which drives the</w:t>
-        <w:br/>
-      </w:r>
-      <w:r>
-        <w:rPr>
-          <w:b/>
-        </w:rPr>
-        <w:t>live Day gauge</w:t>
-      </w:r>
-      <w:r>
-        <w:rPr/>
-        <w:t xml:space="preserve">, scores </w:t>
-      </w:r>
-      <w:r>
-        <w:rPr>
-          <w:b/>
-        </w:rPr>
-        <w:t>92.50</w:t>
-      </w:r>
-      <w:r>
-        <w:rPr/>
-        <w:t>.</w:t>
-      </w:r>
-    </w:p>
-    <w:p>
-      <w:r>
-        <w:rPr/>
-        <w:t>The failure is silent: nothing in the payload marks the inputs as missing, so the</w:t>
-        <w:br/>
-        <w:t xml:space="preserve">gauge renders a confident bullish number built on nothing. A fix must cover </w:t>
-      </w:r>
-      <w:r>
-        <w:rPr>
-          <w:b/>
-        </w:rPr>
-        <w:t>both</w:t>
-        <w:br/>
-        <w:t>call sites with one shared filter</w:t>
-      </w:r>
-      <w:r>
-        <w:rPr/>
-        <w:t xml:space="preserve"> — patching only </w:t>
-      </w:r>
-      <w:r>
-        <w:rPr>
-          <w:rFonts w:ascii="Consolas" w:hAnsi="Consolas"/>
-          <w:color w:val="334455"/>
-          <w:sz w:val="19"/>
-        </w:rPr>
-        <w:t>score_price</w:t>
-      </w:r>
-      <w:r>
-        <w:rPr/>
-        <w:t xml:space="preserve"> leaves the live</w:t>
-        <w:br/>
-        <w:t>gauge wrong.</w:t>
-      </w:r>
-    </w:p>
-    <w:p>
-      <w:r>
-        <w:rPr>
-          <w:b/>
-        </w:rPr>
-        <w:t>Until it is fixed</w:t>
-      </w:r>
-      <w:r>
-        <w:rPr/>
-        <w:t>, treat a strongly bullish structural reading with</w:t>
-        <w:br/>
-      </w:r>
-      <w:r>
-        <w:rPr>
-          <w:i/>
-        </w:rPr>
-        <w:t>unremarkable</w:t>
-      </w:r>
-      <w:r>
-        <w:rPr/>
-        <w:t xml:space="preserve"> confidence as suspect, and cross-check against the Market Dashboard.</w:t>
-      </w:r>
-    </w:p>
-    <w:p>
-      <w:pPr>
-        <w:pStyle w:val="Heading2"/>
-      </w:pPr>
-      <w:r>
-        <w:rPr/>
-        <w:t>Expected Move deliberately disagrees with ThinkorSwim</w:t>
-      </w:r>
-    </w:p>
-    <w:p>
-      <w:r>
-        <w:rPr/>
-        <w:t>Not a defect — a definitional difference that has been measured and is documented</w:t>
-        <w:br/>
-        <w:t xml:space="preserve">in full under </w:t>
-      </w:r>
-      <w:r>
-        <w:rPr>
-          <w:i/>
-        </w:rPr>
-        <w:t>Expected move and IV analysis</w:t>
-      </w:r>
-      <w:r>
-        <w:rPr/>
-        <w:t>. Two independent differences push in</w:t>
-        <w:br/>
-        <w:t xml:space="preserve">opposite directions and </w:t>
-      </w:r>
-      <w:r>
-        <w:rPr>
-          <w:b/>
-        </w:rPr>
-        <w:t>nearly cancelled on the one symbol they were measured on</w:t>
-      </w:r>
-      <w:r>
-        <w:rPr/>
-        <w:t>,</w:t>
-        <w:br/>
-        <w:t>which is luck rather than calibration. Do not "fix" either number to match a broker</w:t>
-        <w:br/>
-        <w:t xml:space="preserve">without first deciding which definition is wanted; the same </w:t>
-      </w:r>
-      <w:r>
-        <w:rPr>
-          <w:rFonts w:ascii="Consolas" w:hAnsi="Consolas"/>
-          <w:color w:val="334455"/>
-          <w:sz w:val="19"/>
-        </w:rPr>
-        <w:t>atm_iv</w:t>
-      </w:r>
-      <w:r>
-        <w:rPr/>
-        <w:t xml:space="preserve"> also sizes the</w:t>
-        <w:br/>
-        <w:t>drawn cone.</w:t>
-      </w:r>
-    </w:p>
-    <w:p>
-      <w:pPr>
-        <w:pStyle w:val="Heading2"/>
-      </w:pPr>
-      <w:r>
-        <w:rPr/>
-        <w:t>Index open interest reads zero after hours</w:t>
-      </w:r>
-    </w:p>
-    <w:p>
-      <w:r>
-        <w:rPr>
-          <w:rFonts w:ascii="Consolas" w:hAnsi="Consolas"/>
-          <w:color w:val="334455"/>
-          <w:sz w:val="19"/>
-        </w:rPr>
-        <w:t>$SPX</w:t>
-      </w:r>
-      <w:r>
-        <w:rPr/>
-        <w:t xml:space="preserve"> and </w:t>
-      </w:r>
-      <w:r>
-        <w:rPr>
-          <w:rFonts w:ascii="Consolas" w:hAnsi="Consolas"/>
-          <w:color w:val="334455"/>
-          <w:sz w:val="19"/>
-        </w:rPr>
-        <w:t>$NDX</w:t>
-      </w:r>
-      <w:r>
-        <w:rPr/>
-        <w:t xml:space="preserve"> report zero open interest overnight, which yields all-zero GEX</w:t>
-        <w:br/>
-        <w:t>grids and arbitrary wall levels. Index gamma is only meaningful during the session.</w:t>
-      </w:r>
-    </w:p>
-    <w:p>
-      <w:r>
-        <w:br/>
-      </w:r>
-    </w:p>
-    <w:p>
-      <w:pPr>
-        <w:pStyle w:val="Heading1"/>
-      </w:pPr>
-      <w:r>
-        <w:rPr/>
-        <w:t>Constants Appendix</w:t>
-      </w:r>
-    </w:p>
-    <w:p>
-      <w:r>
-        <w:rPr/>
-        <w:t>A consolidated table of the load-bearing constants. The cited file governs.</w:t>
+        <w:rPr/>
+        <w:t xml:space="preserve">Every source is a free public feed listed in </w:t>
+      </w:r>
+      <w:r>
+        <w:rPr>
+          <w:rFonts w:ascii="Consolas" w:hAnsi="Consolas"/>
+          <w:color w:val="334455"/>
+          <w:sz w:val="19"/>
+        </w:rPr>
+        <w:t>config/news.toml [[feeds]]</w:t>
+      </w:r>
+      <w:r>
+        <w:rPr/>
+        <w:t>, one</w:t>
+        <w:br/>
+        <w:t xml:space="preserve">adapter per </w:t>
+      </w:r>
+      <w:r>
+        <w:rPr>
+          <w:rFonts w:ascii="Consolas" w:hAnsi="Consolas"/>
+          <w:color w:val="334455"/>
+          <w:sz w:val="19"/>
+        </w:rPr>
+        <w:t>kind</w:t>
+      </w:r>
+      <w:r>
+        <w:rPr/>
+        <w:t xml:space="preserve"> (</w:t>
+      </w:r>
+      <w:r>
+        <w:rPr>
+          <w:rFonts w:ascii="Consolas" w:hAnsi="Consolas"/>
+          <w:color w:val="334455"/>
+          <w:sz w:val="19"/>
+        </w:rPr>
+        <w:t>services/news_svc/adapters/</w:t>
+      </w:r>
+      <w:r>
+        <w:rPr/>
+        <w:t>), each a pure parse over the</w:t>
+        <w:br/>
+        <w:t>fetched bytes:</w:t>
       </w:r>
     </w:p>
     <w:tbl>
@@ -30223,6 +30146,1236 @@
               <w:rPr>
                 <w:b/>
               </w:rPr>
+              <w:t>kind</w:t>
+            </w:r>
+          </w:p>
+        </w:tc>
+        <w:tc>
+          <w:tcPr>
+            <w:tcW w:type="dxa" w:w="2880"/>
+            <w:shd w:val="clear" w:color="auto" w:fill="EAF2FB"/>
+          </w:tcPr>
+          <w:p>
+            <w:r>
+              <w:rPr>
+                <w:b/>
+              </w:rPr>
+            </w:r>
+            <w:r>
+              <w:rPr>
+                <w:b/>
+              </w:rPr>
+              <w:t>Fetches</w:t>
+            </w:r>
+          </w:p>
+        </w:tc>
+        <w:tc>
+          <w:tcPr>
+            <w:tcW w:type="dxa" w:w="2880"/>
+            <w:shd w:val="clear" w:color="auto" w:fill="EAF2FB"/>
+          </w:tcPr>
+          <w:p>
+            <w:r>
+              <w:rPr>
+                <w:b/>
+              </w:rPr>
+            </w:r>
+            <w:r>
+              <w:rPr>
+                <w:b/>
+              </w:rPr>
+              <w:t>Notes</w:t>
+            </w:r>
+          </w:p>
+        </w:tc>
+      </w:tr>
+      <w:tr>
+        <w:tc>
+          <w:tcPr>
+            <w:tcW w:type="dxa" w:w="2880"/>
+          </w:tcPr>
+          <w:p>
+            <w:r/>
+            <w:r>
+              <w:rPr>
+                <w:rFonts w:ascii="Consolas" w:hAnsi="Consolas"/>
+                <w:color w:val="334455"/>
+                <w:sz w:val="19"/>
+              </w:rPr>
+              <w:t>rss</w:t>
+            </w:r>
+          </w:p>
+        </w:tc>
+        <w:tc>
+          <w:tcPr>
+            <w:tcW w:type="dxa" w:w="2880"/>
+          </w:tcPr>
+          <w:p>
+            <w:r/>
+            <w:r>
+              <w:rPr/>
+              <w:t>one URL (MarketWatch, CNBC, ZeroHedge, Benzinga, Federal Reserve, PR Newswire, GlobeNewswire, Business Wire, the Truth Social archive)</w:t>
+            </w:r>
+          </w:p>
+        </w:tc>
+        <w:tc>
+          <w:tcPr>
+            <w:tcW w:type="dxa" w:w="2880"/>
+          </w:tcPr>
+          <w:p>
+            <w:r/>
+            <w:r>
+              <w:rPr/>
+              <w:t xml:space="preserve">Conditional GET: </w:t>
+            </w:r>
+            <w:r>
+              <w:rPr>
+                <w:rFonts w:ascii="Consolas" w:hAnsi="Consolas"/>
+                <w:color w:val="334455"/>
+                <w:sz w:val="19"/>
+              </w:rPr>
+              <w:t>ETag</w:t>
+            </w:r>
+            <w:r>
+              <w:rPr/>
+              <w:t xml:space="preserve"> / </w:t>
+            </w:r>
+            <w:r>
+              <w:rPr>
+                <w:rFonts w:ascii="Consolas" w:hAnsi="Consolas"/>
+                <w:color w:val="334455"/>
+                <w:sz w:val="19"/>
+              </w:rPr>
+              <w:t>Last-Modified</w:t>
+            </w:r>
+            <w:r>
+              <w:rPr/>
+              <w:t xml:space="preserve"> are sent back, so an unchanged feed costs a 304. GlobeNewswire ships </w:t>
+            </w:r>
+            <w:r>
+              <w:rPr>
+                <w:b/>
+              </w:rPr>
+              <w:t>disabled</w:t>
+            </w:r>
+            <w:r>
+              <w:rPr/>
+              <w:t xml:space="preserve"> — its host drops non-browser clients</w:t>
+            </w:r>
+          </w:p>
+        </w:tc>
+      </w:tr>
+      <w:tr>
+        <w:tc>
+          <w:tcPr>
+            <w:tcW w:type="dxa" w:w="2880"/>
+            <w:shd w:val="clear" w:color="auto" w:fill="F4F6FA"/>
+          </w:tcPr>
+          <w:p>
+            <w:r/>
+            <w:r>
+              <w:rPr>
+                <w:rFonts w:ascii="Consolas" w:hAnsi="Consolas"/>
+                <w:color w:val="334455"/>
+                <w:sz w:val="19"/>
+              </w:rPr>
+              <w:t>yahoo_ticker</w:t>
+            </w:r>
+          </w:p>
+        </w:tc>
+        <w:tc>
+          <w:tcPr>
+            <w:tcW w:type="dxa" w:w="2880"/>
+            <w:shd w:val="clear" w:color="auto" w:fill="F4F6FA"/>
+          </w:tcPr>
+          <w:p>
+            <w:r/>
+            <w:r>
+              <w:rPr/>
+              <w:t>the URL template once per ticker in the ticker set, 4 at a time</w:t>
+            </w:r>
+          </w:p>
+        </w:tc>
+        <w:tc>
+          <w:tcPr>
+            <w:tcW w:type="dxa" w:w="2880"/>
+            <w:shd w:val="clear" w:color="auto" w:fill="F4F6FA"/>
+          </w:tcPr>
+          <w:p>
+            <w:r/>
+            <w:r>
+              <w:rPr/>
+              <w:t>Each item carries the ticker it was fetched for</w:t>
+            </w:r>
+          </w:p>
+        </w:tc>
+      </w:tr>
+      <w:tr>
+        <w:tc>
+          <w:tcPr>
+            <w:tcW w:type="dxa" w:w="2880"/>
+          </w:tcPr>
+          <w:p>
+            <w:r/>
+            <w:r>
+              <w:rPr>
+                <w:rFonts w:ascii="Consolas" w:hAnsi="Consolas"/>
+                <w:color w:val="334455"/>
+                <w:sz w:val="19"/>
+              </w:rPr>
+              <w:t>google_news</w:t>
+            </w:r>
+          </w:p>
+        </w:tc>
+        <w:tc>
+          <w:tcPr>
+            <w:tcW w:type="dxa" w:w="2880"/>
+          </w:tcPr>
+          <w:p>
+            <w:r/>
+            <w:r>
+              <w:rPr/>
+              <w:t>one Google News search (WSJ, Seeking Alpha)</w:t>
+            </w:r>
+          </w:p>
+        </w:tc>
+        <w:tc>
+          <w:tcPr>
+            <w:tcW w:type="dxa" w:w="2880"/>
+          </w:tcPr>
+          <w:p>
+            <w:r/>
+            <w:r>
+              <w:rPr/>
+              <w:t xml:space="preserve">Links stay Google redirects; the publisher comes from the item's </w:t>
+            </w:r>
+            <w:r>
+              <w:rPr>
+                <w:rFonts w:ascii="Consolas" w:hAnsi="Consolas"/>
+                <w:color w:val="334455"/>
+                <w:sz w:val="19"/>
+              </w:rPr>
+              <w:t>&lt;source&gt;</w:t>
+            </w:r>
+          </w:p>
+        </w:tc>
+      </w:tr>
+      <w:tr>
+        <w:tc>
+          <w:tcPr>
+            <w:tcW w:type="dxa" w:w="2880"/>
+            <w:shd w:val="clear" w:color="auto" w:fill="F4F6FA"/>
+          </w:tcPr>
+          <w:p>
+            <w:r/>
+            <w:r>
+              <w:rPr>
+                <w:rFonts w:ascii="Consolas" w:hAnsi="Consolas"/>
+                <w:color w:val="334455"/>
+                <w:sz w:val="19"/>
+              </w:rPr>
+              <w:t>edgar_form4</w:t>
+            </w:r>
+          </w:p>
+        </w:tc>
+        <w:tc>
+          <w:tcPr>
+            <w:tcW w:type="dxa" w:w="2880"/>
+            <w:shd w:val="clear" w:color="auto" w:fill="F4F6FA"/>
+          </w:tcPr>
+          <w:p>
+            <w:r/>
+            <w:r>
+              <w:rPr/>
+              <w:t>EDGAR's current-filings Atom for Form 4, then each new filing's ownership XML</w:t>
+            </w:r>
+          </w:p>
+        </w:tc>
+        <w:tc>
+          <w:tcPr>
+            <w:tcW w:type="dxa" w:w="2880"/>
+            <w:shd w:val="clear" w:color="auto" w:fill="F4F6FA"/>
+          </w:tcPr>
+          <w:p>
+            <w:r/>
+            <w:r>
+              <w:rPr/>
+              <w:t xml:space="preserve">Open-market </w:t>
+            </w:r>
+            <w:r>
+              <w:rPr>
+                <w:b/>
+              </w:rPr>
+              <w:t>purchases</w:t>
+            </w:r>
+            <w:r>
+              <w:rPr/>
+              <w:t xml:space="preserve"> (code P) only; a buy on an untracked ticker shows only at or above </w:t>
+            </w:r>
+            <w:r>
+              <w:rPr>
+                <w:rFonts w:ascii="Consolas" w:hAnsi="Consolas"/>
+                <w:color w:val="334455"/>
+                <w:sz w:val="19"/>
+              </w:rPr>
+              <w:t>min_value_usd</w:t>
+            </w:r>
+            <w:r>
+              <w:rPr/>
+              <w:t xml:space="preserve"> ($1,000,000)</w:t>
+            </w:r>
+          </w:p>
+        </w:tc>
+      </w:tr>
+      <w:tr>
+        <w:tc>
+          <w:tcPr>
+            <w:tcW w:type="dxa" w:w="2880"/>
+          </w:tcPr>
+          <w:p>
+            <w:r/>
+            <w:r>
+              <w:rPr>
+                <w:rFonts w:ascii="Consolas" w:hAnsi="Consolas"/>
+                <w:color w:val="334455"/>
+                <w:sz w:val="19"/>
+              </w:rPr>
+              <w:t>edgar_filings</w:t>
+            </w:r>
+          </w:p>
+        </w:tc>
+        <w:tc>
+          <w:tcPr>
+            <w:tcW w:type="dxa" w:w="2880"/>
+          </w:tcPr>
+          <w:p>
+            <w:r/>
+            <w:r>
+              <w:rPr/>
+              <w:t>the same Atom per form (</w:t>
+            </w:r>
+            <w:r>
+              <w:rPr>
+                <w:rFonts w:ascii="Consolas" w:hAnsi="Consolas"/>
+                <w:color w:val="334455"/>
+                <w:sz w:val="19"/>
+              </w:rPr>
+              <w:t>S-1</w:t>
+            </w:r>
+            <w:r>
+              <w:rPr/>
+              <w:t xml:space="preserve">, </w:t>
+            </w:r>
+            <w:r>
+              <w:rPr>
+                <w:rFonts w:ascii="Consolas" w:hAnsi="Consolas"/>
+                <w:color w:val="334455"/>
+                <w:sz w:val="19"/>
+              </w:rPr>
+              <w:t>S-3</w:t>
+            </w:r>
+            <w:r>
+              <w:rPr/>
+              <w:t xml:space="preserve">, </w:t>
+            </w:r>
+            <w:r>
+              <w:rPr>
+                <w:rFonts w:ascii="Consolas" w:hAnsi="Consolas"/>
+                <w:color w:val="334455"/>
+                <w:sz w:val="19"/>
+              </w:rPr>
+              <w:t>424B5</w:t>
+            </w:r>
+            <w:r>
+              <w:rPr/>
+              <w:t>)</w:t>
+            </w:r>
+          </w:p>
+        </w:tc>
+        <w:tc>
+          <w:tcPr>
+            <w:tcW w:type="dxa" w:w="2880"/>
+          </w:tcPr>
+          <w:p>
+            <w:r/>
+            <w:r>
+              <w:rPr/>
+              <w:t>Headline "</w:t>
+            </w:r>
+            <w:r>
+              <w:rPr>
+                <w:rFonts w:ascii="Consolas" w:hAnsi="Consolas"/>
+                <w:color w:val="334455"/>
+                <w:sz w:val="19"/>
+              </w:rPr>
+              <w:t>&lt;company&gt;</w:t>
+            </w:r>
+            <w:r>
+              <w:rPr/>
+              <w:t xml:space="preserve"> files </w:t>
+            </w:r>
+            <w:r>
+              <w:rPr>
+                <w:rFonts w:ascii="Consolas" w:hAnsi="Consolas"/>
+                <w:color w:val="334455"/>
+                <w:sz w:val="19"/>
+              </w:rPr>
+              <w:t>&lt;form&gt;</w:t>
+            </w:r>
+            <w:r>
+              <w:rPr/>
+              <w:t>"</w:t>
+            </w:r>
+          </w:p>
+        </w:tc>
+      </w:tr>
+    </w:tbl>
+    <w:p/>
+    <w:p>
+      <w:r>
+        <w:rPr/>
+        <w:t xml:space="preserve">The SEC gets </w:t>
+      </w:r>
+      <w:r>
+        <w:rPr>
+          <w:rFonts w:ascii="Consolas" w:hAnsi="Consolas"/>
+          <w:color w:val="334455"/>
+          <w:sz w:val="19"/>
+        </w:rPr>
+        <w:t>sec_user_agent</w:t>
+      </w:r>
+      <w:r>
+        <w:rPr/>
+        <w:t xml:space="preserve"> (it requires a contact) at most one request every</w:t>
+        <w:br/>
+        <w:t xml:space="preserve">0.15 s; every other feed gets </w:t>
+      </w:r>
+      <w:r>
+        <w:rPr>
+          <w:rFonts w:ascii="Consolas" w:hAnsi="Consolas"/>
+          <w:color w:val="334455"/>
+          <w:sz w:val="19"/>
+        </w:rPr>
+        <w:t>feed_user_agent</w:t>
+      </w:r>
+      <w:r>
+        <w:rPr/>
+        <w:t xml:space="preserve">, which must keep a </w:t>
+      </w:r>
+      <w:r>
+        <w:rPr>
+          <w:rFonts w:ascii="Consolas" w:hAnsi="Consolas"/>
+          <w:color w:val="334455"/>
+          <w:sz w:val="19"/>
+        </w:rPr>
+        <w:t>Mozilla/5.0</w:t>
+      </w:r>
+      <w:r>
+        <w:rPr/>
+        <w:br/>
+        <w:t xml:space="preserve">token (Yahoo answers a 404 without one). A response over </w:t>
+      </w:r>
+      <w:r>
+        <w:rPr>
+          <w:rFonts w:ascii="Consolas" w:hAnsi="Consolas"/>
+          <w:color w:val="334455"/>
+          <w:sz w:val="19"/>
+        </w:rPr>
+        <w:t>max_body_bytes</w:t>
+      </w:r>
+      <w:r>
+        <w:rPr/>
+        <w:t xml:space="preserve"> (5 MB) is</w:t>
+        <w:br/>
+        <w:t xml:space="preserve">refused, and each fetch has a total deadline of </w:t>
+      </w:r>
+      <w:r>
+        <w:rPr>
+          <w:b/>
+        </w:rPr>
+        <w:t xml:space="preserve">3 × </w:t>
+      </w:r>
+      <w:r>
+        <w:rPr>
+          <w:rFonts w:ascii="Consolas" w:hAnsi="Consolas"/>
+          <w:color w:val="334455"/>
+          <w:sz w:val="19"/>
+        </w:rPr>
+        <w:t>request_timeout_s</w:t>
+      </w:r>
+      <w:r>
+        <w:rPr/>
+        <w:br/>
+        <w:t>enforced by a watchdog that closes the socket, so a server trickling bytes cannot</w:t>
+        <w:br/>
+        <w:t>hold the poll.</w:t>
+      </w:r>
+    </w:p>
+    <w:p>
+      <w:pPr>
+        <w:pStyle w:val="Heading2"/>
+      </w:pPr>
+      <w:r>
+        <w:rPr/>
+        <w:t>Tickers, duplicates, retention</w:t>
+      </w:r>
+    </w:p>
+    <w:p>
+      <w:pPr>
+        <w:pStyle w:val="ListBullet"/>
+      </w:pPr>
+      <w:r>
+        <w:rPr>
+          <w:b/>
+        </w:rPr>
+        <w:t>Tickers are explicit only</w:t>
+      </w:r>
+      <w:r>
+        <w:t>: a cashtag (</w:t>
+      </w:r>
+      <w:r>
+        <w:rPr>
+          <w:rFonts w:ascii="Consolas" w:hAnsi="Consolas"/>
+          <w:color w:val="334455"/>
+          <w:sz w:val="19"/>
+        </w:rPr>
+        <w:t>$NVDA</w:t>
+      </w:r>
+      <w:r>
+        <w:t>), an exchange prefix</w:t>
+        <w:br/>
+        <w:t xml:space="preserve">  (</w:t>
+      </w:r>
+      <w:r>
+        <w:rPr>
+          <w:rFonts w:ascii="Consolas" w:hAnsi="Consolas"/>
+          <w:color w:val="334455"/>
+          <w:sz w:val="19"/>
+        </w:rPr>
+        <w:t>(NASDAQ: NVDA)</w:t>
+      </w:r>
+      <w:r>
+        <w:t>), or a bare bracket of 3–6 letters (</w:t>
+      </w:r>
+      <w:r>
+        <w:rPr>
+          <w:rFonts w:ascii="Consolas" w:hAnsi="Consolas"/>
+          <w:color w:val="334455"/>
+          <w:sz w:val="19"/>
+        </w:rPr>
+        <w:t>(NVDA)</w:t>
+      </w:r>
+      <w:r>
+        <w:t>), matched against</w:t>
+        <w:br/>
+        <w:t xml:space="preserve">  the ticker set — the GEX collection list plus </w:t>
+      </w:r>
+      <w:r>
+        <w:rPr>
+          <w:rFonts w:ascii="Consolas" w:hAnsi="Consolas"/>
+          <w:color w:val="334455"/>
+          <w:sz w:val="19"/>
+        </w:rPr>
+        <w:t>[tickers] extras</w:t>
+      </w:r>
+      <w:r>
+        <w:t>. A company name</w:t>
+        <w:br/>
+        <w:t xml:space="preserve">  never tags. EDGAR items resolve through the SEC's CIK map; Yahoo items carry their</w:t>
+        <w:br/>
+        <w:t xml:space="preserve">  fetch ticker.</w:t>
+      </w:r>
+    </w:p>
+    <w:p>
+      <w:pPr>
+        <w:pStyle w:val="ListBullet"/>
+      </w:pPr>
+      <w:r>
+        <w:rPr>
+          <w:b/>
+        </w:rPr>
+        <w:t>An item's id</w:t>
+      </w:r>
+      <w:r>
+        <w:t xml:space="preserve"> is a hash of its canonical URL (tracking parameters and the</w:t>
+        <w:br/>
+        <w:t xml:space="preserve">  fragment removed). The same id from another feed adds that feed's badge and</w:t>
+        <w:br/>
+        <w:t xml:space="preserve">  tickers to the stored row.</w:t>
+      </w:r>
+    </w:p>
+    <w:p>
+      <w:pPr>
+        <w:pStyle w:val="ListBullet"/>
+      </w:pPr>
+      <w:r>
+        <w:rPr>
+          <w:b/>
+        </w:rPr>
+        <w:t>The same headline under a different URL</w:t>
+      </w:r>
+      <w:r>
+        <w:t xml:space="preserve"> is one story when it comes from a</w:t>
+        <w:br/>
+        <w:t xml:space="preserve">  </w:t>
+      </w:r>
+      <w:r>
+        <w:rPr>
+          <w:b/>
+        </w:rPr>
+        <w:t>different</w:t>
+      </w:r>
+      <w:r>
+        <w:t xml:space="preserve"> feed within a day, or from the </w:t>
+      </w:r>
+      <w:r>
+        <w:rPr>
+          <w:b/>
+        </w:rPr>
+        <w:t>same</w:t>
+      </w:r>
+      <w:r>
+        <w:t xml:space="preserve"> feed within</w:t>
+        <w:br/>
+        <w:t xml:space="preserve">  </w:t>
+      </w:r>
+      <w:r>
+        <w:rPr>
+          <w:rFonts w:ascii="Consolas" w:hAnsi="Consolas"/>
+          <w:color w:val="334455"/>
+          <w:sz w:val="19"/>
+        </w:rPr>
+        <w:t>[dedupe] same_feed_merge_h</w:t>
+      </w:r>
+      <w:r>
+        <w:t xml:space="preserve"> (6 h; 0 turns that off). SEC items never take the</w:t>
+        <w:br/>
+        <w:t xml:space="preserve">  same-feed rule — their titles are templated, so two filings would fold into one.</w:t>
+      </w:r>
+    </w:p>
+    <w:p>
+      <w:pPr>
+        <w:pStyle w:val="ListBullet"/>
+      </w:pPr>
+      <w:r>
+        <w:t xml:space="preserve">The store keeps </w:t>
+      </w:r>
+      <w:r>
+        <w:rPr>
+          <w:b/>
+        </w:rPr>
+        <w:t>7 days</w:t>
+      </w:r>
+      <w:r>
+        <w:t xml:space="preserve"> (</w:t>
+      </w:r>
+      <w:r>
+        <w:rPr>
+          <w:rFonts w:ascii="Consolas" w:hAnsi="Consolas"/>
+          <w:color w:val="334455"/>
+          <w:sz w:val="19"/>
+        </w:rPr>
+        <w:t>keep_days</w:t>
+      </w:r>
+      <w:r>
+        <w:t xml:space="preserve">); each publish carries the newest </w:t>
+      </w:r>
+      <w:r>
+        <w:rPr>
+          <w:b/>
+        </w:rPr>
+        <w:t>300</w:t>
+      </w:r>
+      <w:r>
+        <w:br/>
+        <w:t xml:space="preserve">  (</w:t>
+      </w:r>
+      <w:r>
+        <w:rPr>
+          <w:rFonts w:ascii="Consolas" w:hAnsi="Consolas"/>
+          <w:color w:val="334455"/>
+          <w:sz w:val="19"/>
+        </w:rPr>
+        <w:t>view_items</w:t>
+      </w:r>
+      <w:r>
+        <w:t>).</w:t>
+      </w:r>
+    </w:p>
+    <w:p>
+      <w:pPr>
+        <w:pStyle w:val="Heading2"/>
+      </w:pPr>
+      <w:r>
+        <w:rPr/>
+        <w:t>Views and the public copy</w:t>
+      </w:r>
+    </w:p>
+    <w:p>
+      <w:r>
+        <w:rPr>
+          <w:rFonts w:ascii="Consolas" w:hAnsi="Consolas"/>
+          <w:color w:val="334455"/>
+          <w:sz w:val="19"/>
+        </w:rPr>
+        <w:t>cache:news:feed</w:t>
+      </w:r>
+      <w:r>
+        <w:rPr/>
+        <w:t xml:space="preserve"> holds every feed; </w:t>
+      </w:r>
+      <w:r>
+        <w:rPr>
+          <w:rFonts w:ascii="Consolas" w:hAnsi="Consolas"/>
+          <w:color w:val="334455"/>
+          <w:sz w:val="19"/>
+        </w:rPr>
+        <w:t>cache:news:feed_public</w:t>
+      </w:r>
+      <w:r>
+        <w:rPr/>
+        <w:t xml:space="preserve"> holds only rows whose</w:t>
+        <w:br/>
+      </w:r>
+      <w:r>
+        <w:rPr>
+          <w:b/>
+        </w:rPr>
+        <w:t>primary</w:t>
+      </w:r>
+      <w:r>
+        <w:rPr/>
+        <w:t xml:space="preserve"> feed is public under the current </w:t>
+      </w:r>
+      <w:r>
+        <w:rPr>
+          <w:rFonts w:ascii="Consolas" w:hAnsi="Consolas"/>
+          <w:color w:val="334455"/>
+          <w:sz w:val="19"/>
+        </w:rPr>
+        <w:t>[feed_flags]</w:t>
+      </w:r>
+      <w:r>
+        <w:rPr/>
+        <w:t>, re-read at every publish,</w:t>
+        <w:br/>
+        <w:t>with each row's tickers and source badges cut to what public feeds contributed.</w:t>
+        <w:br/>
+      </w:r>
+      <w:r>
+        <w:rPr>
+          <w:rFonts w:ascii="Consolas" w:hAnsi="Consolas"/>
+          <w:color w:val="334455"/>
+          <w:sz w:val="19"/>
+        </w:rPr>
+        <w:t>cache:news:status</w:t>
+      </w:r>
+      <w:r>
+        <w:rPr/>
+        <w:t xml:space="preserve"> is one row per configured feed. The two feed views carry no</w:t>
+        <w:br/>
+        <w:t xml:space="preserve">timestamp and publish </w:t>
+      </w:r>
+      <w:r>
+        <w:rPr>
+          <w:rFonts w:ascii="Consolas" w:hAnsi="Consolas"/>
+          <w:color w:val="334455"/>
+          <w:sz w:val="19"/>
+        </w:rPr>
+        <w:t>skip_unchanged</w:t>
+      </w:r>
+      <w:r>
+        <w:rPr/>
+        <w:t>, so a poll that found nothing new repaints</w:t>
+        <w:br/>
+        <w:t xml:space="preserve">nothing; the page's "Updated" stamp is the key's </w:t>
+      </w:r>
+      <w:r>
+        <w:rPr>
+          <w:rFonts w:ascii="Consolas" w:hAnsi="Consolas"/>
+          <w:color w:val="334455"/>
+          <w:sz w:val="19"/>
+        </w:rPr>
+        <w:t>:ts</w:t>
+      </w:r>
+      <w:r>
+        <w:rPr/>
+        <w:t xml:space="preserve"> side key, refreshed on every</w:t>
+        <w:br/>
+        <w:t>publish.</w:t>
+      </w:r>
+    </w:p>
+    <w:p>
+      <w:r>
+        <w:rPr>
+          <w:b/>
+        </w:rPr>
+        <w:t>Trending</w:t>
+      </w:r>
+      <w:r>
+        <w:rPr/>
+        <w:t xml:space="preserve"> counts the tickers on items published within </w:t>
+      </w:r>
+      <w:r>
+        <w:rPr>
+          <w:rFonts w:ascii="Consolas" w:hAnsi="Consolas"/>
+          <w:color w:val="334455"/>
+          <w:sz w:val="19"/>
+        </w:rPr>
+        <w:t>[trending] window_h</w:t>
+      </w:r>
+      <w:r>
+        <w:rPr/>
+        <w:br/>
+        <w:t xml:space="preserve">(6 h), skipping </w:t>
+      </w:r>
+      <w:r>
+        <w:rPr>
+          <w:rFonts w:ascii="Consolas" w:hAnsi="Consolas"/>
+          <w:color w:val="334455"/>
+          <w:sz w:val="19"/>
+        </w:rPr>
+        <w:t>yahoo_ticker</w:t>
+      </w:r>
+      <w:r>
+        <w:rPr/>
+        <w:t xml:space="preserve"> items, whose tag is the ticker they were fetched for.</w:t>
+      </w:r>
+    </w:p>
+    <w:p>
+      <w:pPr>
+        <w:pStyle w:val="Heading2"/>
+      </w:pPr>
+      <w:r>
+        <w:rPr/>
+        <w:t>Failure policy</w:t>
+      </w:r>
+    </w:p>
+    <w:p>
+      <w:r>
+        <w:rPr/>
+        <w:t xml:space="preserve">One failing feed never stops the poll: it counts one </w:t>
+      </w:r>
+      <w:r>
+        <w:rPr>
+          <w:rFonts w:ascii="Consolas" w:hAnsi="Consolas"/>
+          <w:color w:val="334455"/>
+          <w:sz w:val="19"/>
+        </w:rPr>
+        <w:t>_degrade</w:t>
+      </w:r>
+      <w:r>
+        <w:rPr/>
+        <w:br/>
+        <w:t>(</w:t>
+      </w:r>
+      <w:r>
+        <w:rPr>
+          <w:rFonts w:ascii="Consolas" w:hAnsi="Consolas"/>
+          <w:color w:val="334455"/>
+          <w:sz w:val="19"/>
+        </w:rPr>
+        <w:t>news.feed.&lt;name&gt;</w:t>
+      </w:r>
+      <w:r>
+        <w:rPr/>
+        <w:t xml:space="preserve">), records its error in </w:t>
+      </w:r>
+      <w:r>
+        <w:rPr>
+          <w:rFonts w:ascii="Consolas" w:hAnsi="Consolas"/>
+          <w:color w:val="334455"/>
+          <w:sz w:val="19"/>
+        </w:rPr>
+        <w:t>cache:news:status</w:t>
+      </w:r>
+      <w:r>
+        <w:rPr/>
+        <w:t>, and keeps its last</w:t>
+        <w:br/>
+        <w:t>items. An SEC 403, 429, 5xx, network failure or missed deadline is treated as an</w:t>
+        <w:br/>
+        <w:t>outage — that accession and every later one are retried next poll — while any other</w:t>
+        <w:br/>
+        <w:t>status is that filing's own answer and is not retried.</w:t>
+      </w:r>
+    </w:p>
+    <w:p>
+      <w:pPr>
+        <w:pStyle w:val="Heading1"/>
+      </w:pPr>
+      <w:r>
+        <w:rPr/>
+        <w:t>Known issues</w:t>
+      </w:r>
+    </w:p>
+    <w:p>
+      <w:r>
+        <w:rPr/>
+        <w:t>Documented defects a maintainer should know about before trusting a number. These</w:t>
+        <w:br/>
+        <w:t>are recorded rather than silently carried.</w:t>
+      </w:r>
+    </w:p>
+    <w:p>
+      <w:pPr>
+        <w:pStyle w:val="Heading2"/>
+      </w:pPr>
+      <w:r>
+        <w:rPr/>
+        <w:t>The PRICE sub-score NaN exposure (open)</w:t>
+      </w:r>
+    </w:p>
+    <w:p>
+      <w:r>
+        <w:rPr>
+          <w:rFonts w:ascii="Consolas" w:hAnsi="Consolas"/>
+          <w:color w:val="334455"/>
+          <w:sz w:val="19"/>
+        </w:rPr>
+        <w:t>sentiment_svc/compute._finite_pcts</w:t>
+      </w:r>
+      <w:r>
+        <w:rPr/>
+        <w:t xml:space="preserve"> guards only the </w:t>
+      </w:r>
+      <w:r>
+        <w:rPr>
+          <w:b/>
+        </w:rPr>
+        <w:t>sector</w:t>
+      </w:r>
+      <w:r>
+        <w:rPr/>
+        <w:t xml:space="preserve"> input. An all-NaN</w:t>
+        <w:br/>
+        <w:t>read of the structural price inputs (</w:t>
+      </w:r>
+      <w:r>
+        <w:rPr>
+          <w:rFonts w:ascii="Consolas" w:hAnsi="Consolas"/>
+          <w:color w:val="334455"/>
+          <w:sz w:val="19"/>
+        </w:rPr>
+        <w:t>macd_hist</w:t>
+      </w:r>
+      <w:r>
+        <w:rPr/>
+        <w:t xml:space="preserve"> / </w:t>
+      </w:r>
+      <w:r>
+        <w:rPr>
+          <w:rFonts w:ascii="Consolas" w:hAnsi="Consolas"/>
+          <w:color w:val="334455"/>
+          <w:sz w:val="19"/>
+        </w:rPr>
+        <w:t>rsi</w:t>
+      </w:r>
+      <w:r>
+        <w:rPr/>
+        <w:t xml:space="preserve"> / </w:t>
+      </w:r>
+      <w:r>
+        <w:rPr>
+          <w:rFonts w:ascii="Consolas" w:hAnsi="Consolas"/>
+          <w:color w:val="334455"/>
+          <w:sz w:val="19"/>
+        </w:rPr>
+        <w:t>adx</w:t>
+      </w:r>
+      <w:r>
+        <w:rPr/>
+        <w:t>, feeding</w:t>
+        <w:br/>
+      </w:r>
+      <w:r>
+        <w:rPr>
+          <w:rFonts w:ascii="Consolas" w:hAnsi="Consolas"/>
+          <w:color w:val="334455"/>
+          <w:sz w:val="19"/>
+        </w:rPr>
+        <w:t>score_price</w:t>
+      </w:r>
+      <w:r>
+        <w:rPr/>
+        <w:t xml:space="preserve"> with a hardcoded </w:t>
+      </w:r>
+      <w:r>
+        <w:rPr>
+          <w:rFonts w:ascii="Consolas" w:hAnsi="Consolas"/>
+          <w:color w:val="334455"/>
+          <w:sz w:val="19"/>
+        </w:rPr>
+        <w:t>vwap_pct = 0.0</w:t>
+      </w:r>
+      <w:r>
+        <w:rPr/>
+        <w:t xml:space="preserve">) scores </w:t>
+      </w:r>
+      <w:r>
+        <w:rPr>
+          <w:b/>
+        </w:rPr>
+        <w:t>82.50 — near-maximum</w:t>
+        <w:br/>
+        <w:t>bullish — at unchanged confidence</w:t>
+      </w:r>
+      <w:r>
+        <w:rPr/>
+        <w:t>, where a sane read of the same tape scores</w:t>
+        <w:br/>
+      </w:r>
+      <w:r>
+        <w:rPr>
+          <w:b/>
+        </w:rPr>
+        <w:t>56.25</w:t>
+      </w:r>
+      <w:r>
+        <w:rPr/>
+        <w:t xml:space="preserve">. The same all-NaN read in </w:t>
+      </w:r>
+      <w:r>
+        <w:rPr>
+          <w:rFonts w:ascii="Consolas" w:hAnsi="Consolas"/>
+          <w:color w:val="334455"/>
+          <w:sz w:val="19"/>
+        </w:rPr>
+        <w:t>compute_intraday_trend</w:t>
+      </w:r>
+      <w:r>
+        <w:rPr/>
+        <w:t>, which drives the</w:t>
+        <w:br/>
+      </w:r>
+      <w:r>
+        <w:rPr>
+          <w:b/>
+        </w:rPr>
+        <w:t>live Day gauge</w:t>
+      </w:r>
+      <w:r>
+        <w:rPr/>
+        <w:t xml:space="preserve">, scores </w:t>
+      </w:r>
+      <w:r>
+        <w:rPr>
+          <w:b/>
+        </w:rPr>
+        <w:t>92.50</w:t>
+      </w:r>
+      <w:r>
+        <w:rPr/>
+        <w:t>.</w:t>
+      </w:r>
+    </w:p>
+    <w:p>
+      <w:r>
+        <w:rPr/>
+        <w:t>The failure is silent: nothing in the payload marks the inputs as missing, so the</w:t>
+        <w:br/>
+        <w:t xml:space="preserve">gauge renders a confident bullish number built on nothing. A fix must cover </w:t>
+      </w:r>
+      <w:r>
+        <w:rPr>
+          <w:b/>
+        </w:rPr>
+        <w:t>both</w:t>
+        <w:br/>
+        <w:t>call sites with one shared filter</w:t>
+      </w:r>
+      <w:r>
+        <w:rPr/>
+        <w:t xml:space="preserve"> — patching only </w:t>
+      </w:r>
+      <w:r>
+        <w:rPr>
+          <w:rFonts w:ascii="Consolas" w:hAnsi="Consolas"/>
+          <w:color w:val="334455"/>
+          <w:sz w:val="19"/>
+        </w:rPr>
+        <w:t>score_price</w:t>
+      </w:r>
+      <w:r>
+        <w:rPr/>
+        <w:t xml:space="preserve"> leaves the live</w:t>
+        <w:br/>
+        <w:t>gauge wrong.</w:t>
+      </w:r>
+    </w:p>
+    <w:p>
+      <w:r>
+        <w:rPr>
+          <w:b/>
+        </w:rPr>
+        <w:t>Until it is fixed</w:t>
+      </w:r>
+      <w:r>
+        <w:rPr/>
+        <w:t>, treat a strongly bullish structural reading with</w:t>
+        <w:br/>
+      </w:r>
+      <w:r>
+        <w:rPr>
+          <w:i/>
+        </w:rPr>
+        <w:t>unremarkable</w:t>
+      </w:r>
+      <w:r>
+        <w:rPr/>
+        <w:t xml:space="preserve"> confidence as suspect, and cross-check against the Market Dashboard.</w:t>
+      </w:r>
+    </w:p>
+    <w:p>
+      <w:pPr>
+        <w:pStyle w:val="Heading2"/>
+      </w:pPr>
+      <w:r>
+        <w:rPr/>
+        <w:t>Expected Move deliberately disagrees with ThinkorSwim</w:t>
+      </w:r>
+    </w:p>
+    <w:p>
+      <w:r>
+        <w:rPr/>
+        <w:t>Not a defect — a definitional difference that has been measured and is documented</w:t>
+        <w:br/>
+        <w:t xml:space="preserve">in full under </w:t>
+      </w:r>
+      <w:r>
+        <w:rPr>
+          <w:i/>
+        </w:rPr>
+        <w:t>Expected move and IV analysis</w:t>
+      </w:r>
+      <w:r>
+        <w:rPr/>
+        <w:t>. Two independent differences push in</w:t>
+        <w:br/>
+        <w:t xml:space="preserve">opposite directions and </w:t>
+      </w:r>
+      <w:r>
+        <w:rPr>
+          <w:b/>
+        </w:rPr>
+        <w:t>nearly cancelled on the one symbol they were measured on</w:t>
+      </w:r>
+      <w:r>
+        <w:rPr/>
+        <w:t>,</w:t>
+        <w:br/>
+        <w:t>which is luck rather than calibration. Do not "fix" either number to match a broker</w:t>
+        <w:br/>
+        <w:t xml:space="preserve">without first deciding which definition is wanted; the same </w:t>
+      </w:r>
+      <w:r>
+        <w:rPr>
+          <w:rFonts w:ascii="Consolas" w:hAnsi="Consolas"/>
+          <w:color w:val="334455"/>
+          <w:sz w:val="19"/>
+        </w:rPr>
+        <w:t>atm_iv</w:t>
+      </w:r>
+      <w:r>
+        <w:rPr/>
+        <w:t xml:space="preserve"> also sizes the</w:t>
+        <w:br/>
+        <w:t>drawn cone.</w:t>
+      </w:r>
+    </w:p>
+    <w:p>
+      <w:pPr>
+        <w:pStyle w:val="Heading2"/>
+      </w:pPr>
+      <w:r>
+        <w:rPr/>
+        <w:t>Index open interest reads zero after hours</w:t>
+      </w:r>
+    </w:p>
+    <w:p>
+      <w:r>
+        <w:rPr>
+          <w:rFonts w:ascii="Consolas" w:hAnsi="Consolas"/>
+          <w:color w:val="334455"/>
+          <w:sz w:val="19"/>
+        </w:rPr>
+        <w:t>$SPX</w:t>
+      </w:r>
+      <w:r>
+        <w:rPr/>
+        <w:t xml:space="preserve"> and </w:t>
+      </w:r>
+      <w:r>
+        <w:rPr>
+          <w:rFonts w:ascii="Consolas" w:hAnsi="Consolas"/>
+          <w:color w:val="334455"/>
+          <w:sz w:val="19"/>
+        </w:rPr>
+        <w:t>$NDX</w:t>
+      </w:r>
+      <w:r>
+        <w:rPr/>
+        <w:t xml:space="preserve"> report zero open interest overnight, which yields all-zero GEX</w:t>
+        <w:br/>
+        <w:t>grids and arbitrary wall levels. Index gamma is only meaningful during the session.</w:t>
+      </w:r>
+    </w:p>
+    <w:p>
+      <w:r>
+        <w:br/>
+      </w:r>
+    </w:p>
+    <w:p>
+      <w:pPr>
+        <w:pStyle w:val="Heading1"/>
+      </w:pPr>
+      <w:r>
+        <w:rPr/>
+        <w:t>Constants Appendix</w:t>
+      </w:r>
+    </w:p>
+    <w:p>
+      <w:r>
+        <w:rPr/>
+        <w:t>A consolidated table of the load-bearing constants. The cited file governs.</w:t>
+      </w:r>
+    </w:p>
+    <w:tbl>
+      <w:tblPr>
+        <w:tblW w:type="auto" w:w="0"/>
+        <w:jc w:val="left"/>
+        <w:tblLayout w:type="autofit"/>
+        <w:tblLook w:firstColumn="1" w:firstRow="1" w:lastColumn="0" w:lastRow="0" w:noHBand="0" w:noVBand="1" w:val="04A0"/>
+        <w:tblBorders>
+          <w:top w:val="single" w:sz="4" w:space="0" w:color="D8DEE9"/>
+          <w:left w:val="single" w:sz="4" w:space="0" w:color="D8DEE9"/>
+          <w:bottom w:val="single" w:sz="4" w:space="0" w:color="D8DEE9"/>
+          <w:right w:val="single" w:sz="4" w:space="0" w:color="D8DEE9"/>
+          <w:insideH w:val="single" w:sz="4" w:space="0" w:color="D8DEE9"/>
+          <w:insideV w:val="single" w:sz="4" w:space="0" w:color="D8DEE9"/>
+        </w:tblBorders>
+      </w:tblPr>
+      <w:tblGrid>
+        <w:gridCol w:w="2880"/>
+        <w:gridCol w:w="2880"/>
+        <w:gridCol w:w="2880"/>
+      </w:tblGrid>
+      <w:tr>
+        <w:tc>
+          <w:tcPr>
+            <w:tcW w:type="dxa" w:w="2880"/>
+            <w:shd w:val="clear" w:color="auto" w:fill="EAF2FB"/>
+          </w:tcPr>
+          <w:p>
+            <w:r>
+              <w:rPr>
+                <w:b/>
+              </w:rPr>
+            </w:r>
+            <w:r>
+              <w:rPr>
+                <w:b/>
+              </w:rPr>
               <w:t>Constant / set</w:t>
             </w:r>
           </w:p>
@@ -32029,6 +33182,156 @@
             <w:r>
               <w:rPr/>
               <w:t xml:space="preserve"> per poll) — no Claude call.</w:t>
+            </w:r>
+          </w:p>
+        </w:tc>
+      </w:tr>
+      <w:tr>
+        <w:tc>
+          <w:tcPr>
+            <w:tcW w:type="dxa" w:w="4320"/>
+            <w:shd w:val="clear" w:color="auto" w:fill="F4F6FA"/>
+          </w:tcPr>
+          <w:p>
+            <w:r/>
+            <w:r>
+              <w:rPr/>
+              <w:t>news_svc</w:t>
+            </w:r>
+          </w:p>
+        </w:tc>
+        <w:tc>
+          <w:tcPr>
+            <w:tcW w:type="dxa" w:w="4320"/>
+            <w:shd w:val="clear" w:color="auto" w:fill="F4F6FA"/>
+          </w:tcPr>
+          <w:p>
+            <w:r/>
+            <w:r>
+              <w:rPr/>
+              <w:t xml:space="preserve">Every feed polled every </w:t>
+            </w:r>
+            <w:r>
+              <w:rPr>
+                <w:b/>
+              </w:rPr>
+              <w:t>5 min</w:t>
+            </w:r>
+            <w:r>
+              <w:rPr/>
+              <w:t xml:space="preserve"> 08:30–15:00 CT (</w:t>
+            </w:r>
+            <w:r>
+              <w:rPr>
+                <w:rFonts w:ascii="Consolas" w:hAnsi="Consolas"/>
+                <w:color w:val="334455"/>
+                <w:sz w:val="19"/>
+              </w:rPr>
+              <w:t>[collector] rth_poll_min</w:t>
+            </w:r>
+            <w:r>
+              <w:rPr/>
+              <w:t xml:space="preserve">), </w:t>
+            </w:r>
+            <w:r>
+              <w:rPr>
+                <w:b/>
+              </w:rPr>
+              <w:t>15 min</w:t>
+            </w:r>
+            <w:r>
+              <w:rPr/>
+              <w:t xml:space="preserve"> otherwise on a trading day (</w:t>
+            </w:r>
+            <w:r>
+              <w:rPr>
+                <w:rFonts w:ascii="Consolas" w:hAnsi="Consolas"/>
+                <w:color w:val="334455"/>
+                <w:sz w:val="19"/>
+              </w:rPr>
+              <w:t>offhours_poll_min</w:t>
+            </w:r>
+            <w:r>
+              <w:rPr/>
+              <w:t xml:space="preserve">), </w:t>
+            </w:r>
+            <w:r>
+              <w:rPr>
+                <w:b/>
+              </w:rPr>
+              <w:t>60 min</w:t>
+            </w:r>
+            <w:r>
+              <w:rPr/>
+              <w:t xml:space="preserve"> at weekends and holidays (</w:t>
+            </w:r>
+            <w:r>
+              <w:rPr>
+                <w:rFonts w:ascii="Consolas" w:hAnsi="Consolas"/>
+                <w:color w:val="334455"/>
+                <w:sz w:val="19"/>
+              </w:rPr>
+              <w:t>weekend_poll_min</w:t>
+            </w:r>
+            <w:r>
+              <w:rPr/>
+              <w:t xml:space="preserve">) — all in </w:t>
+            </w:r>
+            <w:r>
+              <w:rPr>
+                <w:rFonts w:ascii="Consolas" w:hAnsi="Consolas"/>
+                <w:color w:val="334455"/>
+                <w:sz w:val="19"/>
+              </w:rPr>
+              <w:t>config/news.toml</w:t>
+            </w:r>
+            <w:r>
+              <w:rPr/>
+              <w:t xml:space="preserve">, editable in Settings. The loop wakes every </w:t>
+            </w:r>
+            <w:r>
+              <w:rPr>
+                <w:b/>
+              </w:rPr>
+              <w:t>30 s</w:t>
+            </w:r>
+            <w:r>
+              <w:rPr/>
+              <w:t xml:space="preserve"> (</w:t>
+            </w:r>
+            <w:r>
+              <w:rPr>
+                <w:rFonts w:ascii="Consolas" w:hAnsi="Consolas"/>
+                <w:color w:val="334455"/>
+                <w:sz w:val="19"/>
+              </w:rPr>
+              <w:t>TICK_S</w:t>
+            </w:r>
+            <w:r>
+              <w:rPr/>
+              <w:t xml:space="preserve">) and counts an interval from the END of the last poll; nothing polls faster than </w:t>
+            </w:r>
+            <w:r>
+              <w:rPr>
+                <w:b/>
+              </w:rPr>
+              <w:t>60 s</w:t>
+            </w:r>
+            <w:r>
+              <w:rPr/>
+              <w:t xml:space="preserve"> (</w:t>
+            </w:r>
+            <w:r>
+              <w:rPr>
+                <w:rFonts w:ascii="Consolas" w:hAnsi="Consolas"/>
+                <w:color w:val="334455"/>
+                <w:sz w:val="19"/>
+              </w:rPr>
+              <w:t>MIN_INTERVAL_S</w:t>
+            </w:r>
+            <w:r>
+              <w:rPr/>
+              <w:t>). One poll at a time: a Refresh during a poll is skipped.</w:t>
             </w:r>
           </w:p>
         </w:tc>

</xml_diff>

<commit_message>
feat(news): SEC Offerings includes S-3ASR
The automatic shelf registration large issuers file. SEC's type= filter is a
prefix match, so the S-3 Atom already lists every S-3ASR; the separate S-3ASR
fetch is kept (each Atom is capped at 100 entries) and the per-poll handled set
takes each accession once. Pinned with the real current-filings fixture.

Co-Authored-By: Claude Opus 5.5 <noreply@anthropic.com>
Claude-Session: https://claude.ai/code/session_014N2du2DmXUxAruBTFwyyAD
</commit_message>
<xml_diff>
--- a/docs/manuals/technical-reference/technical-reference.docx
+++ b/docs/manuals/technical-reference/technical-reference.docx
@@ -30485,6 +30485,18 @@
                 <w:sz w:val="19"/>
               </w:rPr>
               <w:t>424B5</w:t>
+            </w:r>
+            <w:r>
+              <w:rPr/>
+              <w:t xml:space="preserve">, </w:t>
+            </w:r>
+            <w:r>
+              <w:rPr>
+                <w:rFonts w:ascii="Consolas" w:hAnsi="Consolas"/>
+                <w:color w:val="334455"/>
+                <w:sz w:val="19"/>
+              </w:rPr>
+              <w:t>S-3ASR</w:t>
             </w:r>
             <w:r>
               <w:rPr/>

</xml_diff>

<commit_message>
docs(news): technical reference names the dividend retry setting
Co-Authored-By: Claude Opus 5.5 <noreply@anthropic.com>
Claude-Session: https://claude.ai/code/session_014N2du2DmXUxAruBTFwyyAD
</commit_message>
<xml_diff>
--- a/docs/manuals/technical-reference/technical-reference.docx
+++ b/docs/manuals/technical-reference/technical-reference.docx
@@ -33774,7 +33774,19 @@
         <w:rPr/>
         <w:t>, never 0. The day is recorded</w:t>
         <w:br/>
-        <w:t>in the store, so a restart does not refetch; a failure retries after 15 min. The</w:t>
+        <w:t xml:space="preserve">in the store, so a restart does not refetch; a failure retries after </w:t>
+      </w:r>
+      <w:r>
+        <w:rPr>
+          <w:rFonts w:ascii="Consolas" w:hAnsi="Consolas"/>
+          <w:color w:val="334455"/>
+          <w:sz w:val="19"/>
+        </w:rPr>
+        <w:t>[calendar.dividends] retry_min</w:t>
+      </w:r>
+      <w:r>
+        <w:rPr/>
+        <w:t xml:space="preserve"> (15 min shipped). The</w:t>
         <w:br/>
       </w:r>
       <w:r>

</xml_diff>

<commit_message>
feat(news): fourteen more feeds, all in the app and on the live page
White House Actions, White House, USTR, SEC Press, EIA, investingLive,
StockStory, Techmeme, Endpoints, Fierce Biotech, The Fly, OilPrice and
CoinDesk as rss feeds, and AP through Google News (AP's own RSS is 403).
Every one enabled and public, and polled once through compute.poll_feed
before commit (all HTTP 200). Chosen from a probe of the operator's
848-row candidate list; manuals list them.

Co-Authored-By: Claude Opus 5.5 <noreply@anthropic.com>
Claude-Session: https://claude.ai/code/session_014N2du2DmXUxAruBTFwyyAD
</commit_message>
<xml_diff>
--- a/docs/manuals/technical-reference/technical-reference.docx
+++ b/docs/manuals/technical-reference/technical-reference.docx
@@ -30242,7 +30242,7 @@
             <w:r/>
             <w:r>
               <w:rPr/>
-              <w:t>one URL (MarketWatch, CNBC, ZeroHedge, Benzinga, Federal Reserve, PR Newswire, GlobeNewswire, Business Wire, the Truth Social archive)</w:t>
+              <w:t>one URL (MarketWatch, CNBC, ZeroHedge, Benzinga, Federal Reserve, PR Newswire, GlobeNewswire, Business Wire, the Truth Social archive, White House Actions, White House, USTR, SEC Press, EIA, investingLive, StockStory, Techmeme, Endpoints, Fierce Biotech, The Fly, OilPrice, CoinDesk)</w:t>
             </w:r>
           </w:p>
         </w:tc>
@@ -30363,7 +30363,7 @@
             <w:r/>
             <w:r>
               <w:rPr/>
-              <w:t>one Google News search (WSJ, Seeking Alpha)</w:t>
+              <w:t>one Google News search (WSJ, Seeking Alpha, AP)</w:t>
             </w:r>
           </w:p>
         </w:tc>

</xml_diff>

<commit_message>
feat(deploy): schedule the Trade Analyzer journal labeler as a systemd timer
tools/label_journal.py ran under Windows Task Scheduler and the 2026-08-29
Linux move gave it no unit, so nothing has labelled the live rec_journal.db
since. A dry run on vps2 found its first five matured readings unlabelled.

- trading-<env>-label-journal.{service,timer} from [slots.label_journal]
  (18:30 CT Mon..Fri), Persistent=true (a catch-up loses nothing),
  EnvironmentFile for PROXY_SHARED_SECRET, TimeoutStartSec 900.
- The command line exits 1 when SPY cannot be fetched, so a failed night
  shows in `systemctl --user --failed`; run() from code still returns 0.
- Slot default, sessions.toml, Settings catalogue, Technical Reference row
  (HTML rebuild also carries the 09-26 news-cadence edit), CHANGELOG.

Co-Authored-By: Claude Opus 5.5 <noreply@anthropic.com>
</commit_message>
<xml_diff>
--- a/docs/manuals/technical-reference/technical-reference.docx
+++ b/docs/manuals/technical-reference/technical-reference.docx
@@ -32,7 +32,7 @@
           <w:color w:val="5B6678"/>
           <w:sz w:val="18"/>
         </w:rPr>
-        <w:t>NeuralStrike · Generated 2026-09-26</w:t>
+        <w:t>NeuralStrike · Generated 2026-09-27</w:t>
       </w:r>
     </w:p>
     <w:p/>
@@ -36474,7 +36474,7 @@
               <w:rPr>
                 <w:b/>
               </w:rPr>
-              <w:t>5 min</w:t>
+              <w:t>2 min</w:t>
             </w:r>
             <w:r>
               <w:rPr/>
@@ -36496,11 +36496,11 @@
               <w:rPr>
                 <w:b/>
               </w:rPr>
-              <w:t>15 min</w:t>
-            </w:r>
-            <w:r>
-              <w:rPr/>
-              <w:t xml:space="preserve"> otherwise on a trading day (</w:t>
+              <w:t>5 min</w:t>
+            </w:r>
+            <w:r>
+              <w:rPr/>
+              <w:t xml:space="preserve"> in the extended sessions 06:30–08:25 and 15:00–15:15 CT (</w:t>
             </w:r>
             <w:r>
               <w:rPr>
@@ -36508,17 +36508,39 @@
                 <w:color w:val="334455"/>
                 <w:sz w:val="19"/>
               </w:rPr>
+              <w:t>eth_poll_min</w:t>
+            </w:r>
+            <w:r>
+              <w:rPr/>
+              <w:t xml:space="preserve">), </w:t>
+            </w:r>
+            <w:r>
+              <w:rPr>
+                <w:b/>
+              </w:rPr>
+              <w:t>30 min</w:t>
+            </w:r>
+            <w:r>
+              <w:rPr/>
+              <w:t xml:space="preserve"> otherwise on a trading day (</w:t>
+            </w:r>
+            <w:r>
+              <w:rPr>
+                <w:rFonts w:ascii="Consolas" w:hAnsi="Consolas"/>
+                <w:color w:val="334455"/>
+                <w:sz w:val="19"/>
+              </w:rPr>
               <w:t>offhours_poll_min</w:t>
             </w:r>
             <w:r>
               <w:rPr/>
-              <w:t xml:space="preserve">), </w:t>
+              <w:t xml:space="preserve">) and </w:t>
             </w:r>
             <w:r>
               <w:rPr>
                 <w:b/>
               </w:rPr>
-              <w:t>60 min</w:t>
+              <w:t>30 min</w:t>
             </w:r>
             <w:r>
               <w:rPr/>
@@ -36630,7 +36652,7 @@
     <w:p>
       <w:r>
         <w:rPr/>
-        <w:t xml:space="preserve">Three once-a-day jobs are </w:t>
+        <w:t xml:space="preserve">Four once-a-day jobs are </w:t>
       </w:r>
       <w:r>
         <w:rPr>
@@ -37003,6 +37025,73 @@
             <w:r>
               <w:rPr/>
               <w:t xml:space="preserve"> / UOA thresholds.</w:t>
+            </w:r>
+          </w:p>
+        </w:tc>
+      </w:tr>
+      <w:tr>
+        <w:tc>
+          <w:tcPr>
+            <w:tcW w:type="dxa" w:w="2880"/>
+            <w:shd w:val="clear" w:color="auto" w:fill="F4F6FA"/>
+          </w:tcPr>
+          <w:p>
+            <w:r/>
+            <w:r>
+              <w:rPr/>
+              <w:t>Trade Analyzer outcome labelling</w:t>
+            </w:r>
+          </w:p>
+        </w:tc>
+        <w:tc>
+          <w:tcPr>
+            <w:tcW w:type="dxa" w:w="2880"/>
+            <w:shd w:val="clear" w:color="auto" w:fill="F4F6FA"/>
+          </w:tcPr>
+          <w:p>
+            <w:r/>
+            <w:r>
+              <w:rPr>
+                <w:b/>
+              </w:rPr>
+              <w:t>18:30</w:t>
+            </w:r>
+            <w:r>
+              <w:rPr/>
+              <w:t xml:space="preserve"> (</w:t>
+            </w:r>
+            <w:r>
+              <w:rPr>
+                <w:rFonts w:ascii="Consolas" w:hAnsi="Consolas"/>
+                <w:color w:val="334455"/>
+                <w:sz w:val="19"/>
+              </w:rPr>
+              <w:t>[slots.label_journal]</w:t>
+            </w:r>
+            <w:r>
+              <w:rPr/>
+              <w:t>)</w:t>
+            </w:r>
+          </w:p>
+        </w:tc>
+        <w:tc>
+          <w:tcPr>
+            <w:tcW w:type="dxa" w:w="2880"/>
+            <w:shd w:val="clear" w:color="auto" w:fill="F4F6FA"/>
+          </w:tcPr>
+          <w:p>
+            <w:r/>
+            <w:r>
+              <w:rPr>
+                <w:rFonts w:ascii="Consolas" w:hAnsi="Consolas"/>
+                <w:color w:val="334455"/>
+                <w:sz w:val="19"/>
+              </w:rPr>
+              <w:t>tools/label_journal.py</w:t>
+            </w:r>
+            <w:r>
+              <w:rPr/>
+              <w:t>: writes the realized 5/10/20-day forward returns (raw, beta-adjusted, and SPY's) onto recommendations whose horizon has passed. One daily-bar fetch per symbol through the proxy; labels everything outstanding, so a missed night catches up.</w:t>
             </w:r>
           </w:p>
         </w:tc>

</xml_diff>

<commit_message>
docs: push-notification checkboxes + trade-idea Google Calendar setup
User Guide (General grid + the one-time Google setup), page help, Technical
Reference, CHANGELOG, and the CLAUDE.md invariant that the switches are
enforced only at discord_target / telegram_target.

Co-Authored-By: Claude Opus 5.5 <noreply@anthropic.com>
</commit_message>
<xml_diff>
--- a/docs/manuals/technical-reference/technical-reference.docx
+++ b/docs/manuals/technical-reference/technical-reference.docx
@@ -32,7 +32,7 @@
           <w:color w:val="5B6678"/>
           <w:sz w:val="18"/>
         </w:rPr>
-        <w:t>NeuralStrike · Generated 2026-09-27</w:t>
+        <w:t>NeuralStrike · Generated 2026-09-28</w:t>
       </w:r>
     </w:p>
     <w:p/>
@@ -4582,7 +4582,147 @@
             </w:r>
             <w:r>
               <w:rPr/>
-              <w:t>. Each channel self-gates — missing creds are a silent no-op. Env vars override file values.</w:t>
+              <w:t xml:space="preserve">. Each channel self-gates — missing creds are a silent no-op. Env vars override file values. </w:t>
+            </w:r>
+            <w:r>
+              <w:rPr>
+                <w:b/>
+              </w:rPr>
+              <w:t>Per-category on/off</w:t>
+            </w:r>
+            <w:r>
+              <w:rPr/>
+              <w:t xml:space="preserve"> lives in </w:t>
+            </w:r>
+            <w:r>
+              <w:rPr>
+                <w:rFonts w:ascii="Consolas" w:hAnsi="Consolas"/>
+                <w:color w:val="334455"/>
+                <w:sz w:val="19"/>
+              </w:rPr>
+              <w:t>config/notify.toml</w:t>
+            </w:r>
+            <w:r>
+              <w:rPr/>
+              <w:t xml:space="preserve"> (</w:t>
+            </w:r>
+            <w:r>
+              <w:rPr>
+                <w:rFonts w:ascii="Consolas" w:hAnsi="Consolas"/>
+                <w:color w:val="334455"/>
+                <w:sz w:val="19"/>
+              </w:rPr>
+              <w:t>[channels.&lt;category&gt;] discord / telegram</w:t>
+            </w:r>
+            <w:r>
+              <w:rPr/>
+              <w:t xml:space="preserve">, all on by default; Settings → General writes </w:t>
+            </w:r>
+            <w:r>
+              <w:rPr>
+                <w:rFonts w:ascii="Consolas" w:hAnsi="Consolas"/>
+                <w:color w:val="334455"/>
+                <w:sz w:val="19"/>
+              </w:rPr>
+              <w:t>config/local/notify.toml</w:t>
+            </w:r>
+            <w:r>
+              <w:rPr/>
+              <w:t xml:space="preserve">), enforced in </w:t>
+            </w:r>
+            <w:r>
+              <w:rPr>
+                <w:rFonts w:ascii="Consolas" w:hAnsi="Consolas"/>
+                <w:color w:val="334455"/>
+                <w:sz w:val="19"/>
+              </w:rPr>
+              <w:t>shared/notify/channels.discord_target</w:t>
+            </w:r>
+            <w:r>
+              <w:rPr/>
+              <w:t xml:space="preserve"> / </w:t>
+            </w:r>
+            <w:r>
+              <w:rPr>
+                <w:rFonts w:ascii="Consolas" w:hAnsi="Consolas"/>
+                <w:color w:val="334455"/>
+                <w:sz w:val="19"/>
+              </w:rPr>
+              <w:t>telegram_target</w:t>
+            </w:r>
+            <w:r>
+              <w:rPr/>
+              <w:t xml:space="preserve"> and read at send time (mtime-cached, no restart). The trade idea's optional </w:t>
+            </w:r>
+            <w:r>
+              <w:rPr>
+                <w:b/>
+              </w:rPr>
+              <w:t>Google Calendar event</w:t>
+            </w:r>
+            <w:r>
+              <w:rPr/>
+              <w:t xml:space="preserve"> (</w:t>
+            </w:r>
+            <w:r>
+              <w:rPr>
+                <w:rFonts w:ascii="Consolas" w:hAnsi="Consolas"/>
+                <w:color w:val="334455"/>
+                <w:sz w:val="19"/>
+              </w:rPr>
+              <w:t>channels.trade_idea.calendar</w:t>
+            </w:r>
+            <w:r>
+              <w:rPr/>
+              <w:t xml:space="preserve">, </w:t>
+            </w:r>
+            <w:r>
+              <w:rPr>
+                <w:rFonts w:ascii="Consolas" w:hAnsi="Consolas"/>
+                <w:color w:val="334455"/>
+                <w:sz w:val="19"/>
+              </w:rPr>
+              <w:t>[calendar] calendar_id / lead_min / duration_min</w:t>
+            </w:r>
+            <w:r>
+              <w:rPr/>
+              <w:t xml:space="preserve">) is created by </w:t>
+            </w:r>
+            <w:r>
+              <w:rPr>
+                <w:rFonts w:ascii="Consolas" w:hAnsi="Consolas"/>
+                <w:color w:val="334455"/>
+                <w:sz w:val="19"/>
+              </w:rPr>
+              <w:t>shared/notify/gcal.py</w:t>
+            </w:r>
+            <w:r>
+              <w:rPr/>
+              <w:t xml:space="preserve"> with the service-account key </w:t>
+            </w:r>
+            <w:r>
+              <w:rPr>
+                <w:rFonts w:ascii="Consolas" w:hAnsi="Consolas"/>
+                <w:color w:val="334455"/>
+                <w:sz w:val="19"/>
+              </w:rPr>
+              <w:t>shared/google_calendar_sa.json</w:t>
+            </w:r>
+            <w:r>
+              <w:rPr/>
+              <w:t>; it uses the calendar's own default notification (</w:t>
+            </w:r>
+            <w:r>
+              <w:rPr>
+                <w:rFonts w:ascii="Consolas" w:hAnsi="Consolas"/>
+                <w:color w:val="334455"/>
+                <w:sz w:val="19"/>
+              </w:rPr>
+              <w:t>reminders.useDefault</w:t>
+            </w:r>
+            <w:r>
+              <w:rPr/>
+              <w:t>).</w:t>
             </w:r>
           </w:p>
         </w:tc>

</xml_diff>

<commit_message>
docs: trade ideas on the public site
Co-Authored-By: Claude Opus 5.5 <noreply@anthropic.com>
</commit_message>
<xml_diff>
--- a/docs/manuals/technical-reference/technical-reference.docx
+++ b/docs/manuals/technical-reference/technical-reference.docx
@@ -32,7 +32,7 @@
           <w:color w:val="5B6678"/>
           <w:sz w:val="18"/>
         </w:rPr>
-        <w:t>NeuralStrike · Generated 2026-09-28</w:t>
+        <w:t>NeuralStrike · Generated 2026-09-29</w:t>
       </w:r>
     </w:p>
     <w:p/>
@@ -4722,7 +4722,89 @@
             </w:r>
             <w:r>
               <w:rPr/>
-              <w:t>).</w:t>
+              <w:t xml:space="preserve">). Each </w:t>
+            </w:r>
+            <w:r>
+              <w:rPr>
+                <w:b/>
+              </w:rPr>
+              <w:t>posted</w:t>
+            </w:r>
+            <w:r>
+              <w:rPr/>
+              <w:t xml:space="preserve"> trade idea is also written into the public site by </w:t>
+            </w:r>
+            <w:r>
+              <w:rPr>
+                <w:rFonts w:ascii="Consolas" w:hAnsi="Consolas"/>
+                <w:color w:val="334455"/>
+                <w:sz w:val="19"/>
+              </w:rPr>
+              <w:t>services/options_svc/site_ideas.py</w:t>
+            </w:r>
+            <w:r>
+              <w:rPr/>
+              <w:t xml:space="preserve"> — </w:t>
+            </w:r>
+            <w:r>
+              <w:rPr>
+                <w:rFonts w:ascii="Consolas" w:hAnsi="Consolas"/>
+                <w:color w:val="334455"/>
+                <w:sz w:val="19"/>
+              </w:rPr>
+              <w:t>deploy/site/ideas/&lt;day&gt;/&lt;HHMM&gt;-&lt;SYMBOL&gt;.{png,webp}</w:t>
+            </w:r>
+            <w:r>
+              <w:rPr/>
+              <w:t xml:space="preserve"> plus the manifest </w:t>
+            </w:r>
+            <w:r>
+              <w:rPr>
+                <w:rFonts w:ascii="Consolas" w:hAnsi="Consolas"/>
+                <w:color w:val="334455"/>
+                <w:sz w:val="19"/>
+              </w:rPr>
+              <w:t>deploy/site/ideas.json</w:t>
+            </w:r>
+            <w:r>
+              <w:rPr/>
+              <w:t xml:space="preserve"> (gitignored), keeping the newest </w:t>
+            </w:r>
+            <w:r>
+              <w:rPr>
+                <w:rFonts w:ascii="Consolas" w:hAnsi="Consolas"/>
+                <w:color w:val="334455"/>
+                <w:sz w:val="19"/>
+              </w:rPr>
+              <w:t>[site] keep_days</w:t>
+            </w:r>
+            <w:r>
+              <w:rPr/>
+              <w:t xml:space="preserve"> posting days (default 6); </w:t>
+            </w:r>
+            <w:r>
+              <w:rPr>
+                <w:rFonts w:ascii="Consolas" w:hAnsi="Consolas"/>
+                <w:color w:val="334455"/>
+                <w:sz w:val="19"/>
+              </w:rPr>
+              <w:t>deploy/site/assets/ideas.js</w:t>
+            </w:r>
+            <w:r>
+              <w:rPr/>
+              <w:t xml:space="preserve"> draws the home page strip and </w:t>
+            </w:r>
+            <w:r>
+              <w:rPr>
+                <w:rFonts w:ascii="Consolas" w:hAnsi="Consolas"/>
+                <w:color w:val="334455"/>
+                <w:sz w:val="19"/>
+              </w:rPr>
+              <w:t>ideas.html</w:t>
+            </w:r>
+            <w:r>
+              <w:rPr/>
+              <w:t xml:space="preserve"> from it.</w:t>
             </w:r>
           </w:p>
         </w:tc>

</xml_diff>

<commit_message>
docs: trade idea results on the site
Co-Authored-By: Claude Opus 5.5 <noreply@anthropic.com>
</commit_message>
<xml_diff>
--- a/docs/manuals/technical-reference/technical-reference.docx
+++ b/docs/manuals/technical-reference/technical-reference.docx
@@ -4804,7 +4804,53 @@
             </w:r>
             <w:r>
               <w:rPr/>
-              <w:t xml:space="preserve"> from it.</w:t>
+              <w:t xml:space="preserve"> from it. Each idea's </w:t>
+            </w:r>
+            <w:r>
+              <w:rPr>
+                <w:b/>
+              </w:rPr>
+              <w:t>result</w:t>
+            </w:r>
+            <w:r>
+              <w:rPr/>
+              <w:t xml:space="preserve"> is computed from the underlying only (no option quote): open = </w:t>
+            </w:r>
+            <w:r>
+              <w:rPr>
+                <w:rFonts w:ascii="Consolas" w:hAnsi="Consolas"/>
+                <w:color w:val="334455"/>
+                <w:sz w:val="19"/>
+              </w:rPr>
+              <w:t>trade_idea.payoff(legs, entry_cash, last)</w:t>
+            </w:r>
+            <w:r>
+              <w:rPr/>
+              <w:t xml:space="preserve"> — the expiry payoff at the current price — refreshed every </w:t>
+            </w:r>
+            <w:r>
+              <w:rPr>
+                <w:rFonts w:ascii="Consolas" w:hAnsi="Consolas"/>
+                <w:color w:val="334455"/>
+                <w:sz w:val="19"/>
+              </w:rPr>
+              <w:t>[site] refresh_min</w:t>
+            </w:r>
+            <w:r>
+              <w:rPr/>
+              <w:t xml:space="preserve"> (default 15) inside 08:00–15:15 CT with one batched </w:t>
+            </w:r>
+            <w:r>
+              <w:rPr>
+                <w:rFonts w:ascii="Consolas" w:hAnsi="Consolas"/>
+                <w:color w:val="334455"/>
+                <w:sz w:val="19"/>
+              </w:rPr>
+              <w:t>/quotes</w:t>
+            </w:r>
+            <w:r>
+              <w:rPr/>
+              <w:t xml:space="preserve"> call; expired = the same payoff at the expiry date's daily close (from 15:05 CT on expiry day), then final. % = result ÷ max loss.</w:t>
             </w:r>
           </w:p>
         </w:tc>

</xml_diff>

<commit_message>
docs: trade idea results under the exit rules
Co-Authored-By: Claude Opus 5.5 <noreply@anthropic.com>
</commit_message>
<xml_diff>
--- a/docs/manuals/technical-reference/technical-reference.docx
+++ b/docs/manuals/technical-reference/technical-reference.docx
@@ -4814,7 +4814,7 @@
             </w:r>
             <w:r>
               <w:rPr/>
-              <w:t xml:space="preserve"> is computed from the underlying only (no option quote): open = </w:t>
+              <w:t xml:space="preserve"> applies the app's exit rules (</w:t>
             </w:r>
             <w:r>
               <w:rPr>
@@ -4822,11 +4822,11 @@
                 <w:color w:val="334455"/>
                 <w:sz w:val="19"/>
               </w:rPr>
-              <w:t>trade_idea.payoff(legs, entry_cash, last)</w:t>
-            </w:r>
-            <w:r>
-              <w:rPr/>
-              <w:t xml:space="preserve"> — the expiry payoff at the current price — refreshed every </w:t>
+              <w:t>trade_mgmt.structure_rules</w:t>
+            </w:r>
+            <w:r>
+              <w:rPr/>
+              <w:t xml:space="preserve">): target = </w:t>
             </w:r>
             <w:r>
               <w:rPr>
@@ -4834,11 +4834,11 @@
                 <w:color w:val="334455"/>
                 <w:sz w:val="19"/>
               </w:rPr>
-              <w:t>[site] refresh_min</w:t>
-            </w:r>
-            <w:r>
-              <w:rPr/>
-              <w:t xml:space="preserve"> (default 15) inside 08:00–15:15 CT with one batched </w:t>
+              <w:t>tp_frac</w:t>
+            </w:r>
+            <w:r>
+              <w:rPr/>
+              <w:t xml:space="preserve"> × the debit (single long option; else max profit) or × the credit; stop = </w:t>
             </w:r>
             <w:r>
               <w:rPr>
@@ -4846,11 +4846,95 @@
                 <w:color w:val="334455"/>
                 <w:sz w:val="19"/>
               </w:rPr>
+              <w:t>debit_stop_frac</w:t>
+            </w:r>
+            <w:r>
+              <w:rPr/>
+              <w:t xml:space="preserve"> × the debit, or </w:t>
+            </w:r>
+            <w:r>
+              <w:rPr>
+                <w:rFonts w:ascii="Consolas" w:hAnsi="Consolas"/>
+                <w:color w:val="334455"/>
+                <w:sz w:val="19"/>
+              </w:rPr>
+              <w:t>stop_mult</w:t>
+            </w:r>
+            <w:r>
+              <w:rPr/>
+              <w:t xml:space="preserve"> × the credit where </w:t>
+            </w:r>
+            <w:r>
+              <w:rPr>
+                <w:rFonts w:ascii="Consolas" w:hAnsi="Consolas"/>
+                <w:color w:val="334455"/>
+                <w:sz w:val="19"/>
+              </w:rPr>
+              <w:t>loss_rules</w:t>
+            </w:r>
+            <w:r>
+              <w:rPr/>
+              <w:t>. The option is modelled — Black-Scholes (</w:t>
+            </w:r>
+            <w:r>
+              <w:rPr>
+                <w:rFonts w:ascii="Consolas" w:hAnsi="Consolas"/>
+                <w:color w:val="334455"/>
+                <w:sz w:val="19"/>
+              </w:rPr>
+              <w:t>options_calculator</w:t>
+            </w:r>
+            <w:r>
+              <w:rPr/>
+              <w:t>) at the IV solved from the entry price at the post — on every 1-minute stock bar (</w:t>
+            </w:r>
+            <w:r>
+              <w:rPr>
+                <w:rFonts w:ascii="Consolas" w:hAnsi="Consolas"/>
+                <w:color w:val="334455"/>
+                <w:sz w:val="19"/>
+              </w:rPr>
+              <w:t>/pricehistory</w:t>
+            </w:r>
+            <w:r>
+              <w:rPr/>
+              <w:t xml:space="preserve">, incremental from </w:t>
+            </w:r>
+            <w:r>
+              <w:rPr>
+                <w:rFonts w:ascii="Consolas" w:hAnsi="Consolas"/>
+                <w:color w:val="334455"/>
+                <w:sz w:val="19"/>
+              </w:rPr>
+              <w:t>checked_to</w:t>
+            </w:r>
+            <w:r>
+              <w:rPr/>
+              <w:t xml:space="preserve">); stop before target, a stop gapped through fills at the bar's open, a target at the level. Unhit ideas settle at intrinsic on the expiry-day daily close. Refreshed every </w:t>
+            </w:r>
+            <w:r>
+              <w:rPr>
+                <w:rFonts w:ascii="Consolas" w:hAnsi="Consolas"/>
+                <w:color w:val="334455"/>
+                <w:sz w:val="19"/>
+              </w:rPr>
+              <w:t>[site] refresh_min</w:t>
+            </w:r>
+            <w:r>
+              <w:rPr/>
+              <w:t xml:space="preserve"> (default 15) inside 08:00–15:15 CT: one batched </w:t>
+            </w:r>
+            <w:r>
+              <w:rPr>
+                <w:rFonts w:ascii="Consolas" w:hAnsi="Consolas"/>
+                <w:color w:val="334455"/>
+                <w:sz w:val="19"/>
+              </w:rPr>
               <w:t>/quotes</w:t>
             </w:r>
             <w:r>
               <w:rPr/>
-              <w:t xml:space="preserve"> call; expired = the same payoff at the expiry date's daily close (from 15:05 CT on expiry day), then final. % = result ÷ max loss.</w:t>
+              <w:t xml:space="preserve"> call plus one minute-history call per symbol. No option quote is read. % = result ÷ max loss.</w:t>
             </w:r>
           </w:p>
         </w:tc>

</xml_diff>

<commit_message>
docs: regenerate site glossary; HIRO doc fixes
deploy/site/glossary.html regenerated with tools/generate_glossary_page.py
so it carries the Options Glossary's new "HIRO / hedging flow" entry.

The design doc, Technical Reference and CHANGELOG now state the new
freshness rules (STALE_ROW_SEC 300 against the clock for both rules; a
reversal's 120 s age against the newest row). The Reference Guide no
longer implies HIRO would chime once validated -- it never does -- and
the User Guide says the Desk speaks every surge at the surge bar while
only the push bar reaches the phone. CHANGELOG lists cb85cdb and the two
fix commits. Manuals rebuilt.

Co-Authored-By: Claude Opus 5.5 <noreply@anthropic.com>
</commit_message>
<xml_diff>
--- a/docs/manuals/technical-reference/technical-reference.docx
+++ b/docs/manuals/technical-reference/technical-reference.docx
@@ -27607,7 +27607,7 @@
             <w:r/>
             <w:r>
               <w:rPr/>
-              <w:t>newest stored row ≤ 120 s old against the clock (</w:t>
+              <w:t>newest stored row ≤ 300 s old against the clock (</w:t>
             </w:r>
             <w:r>
               <w:rPr>
@@ -27615,7 +27615,7 @@
                 <w:color w:val="334455"/>
                 <w:sz w:val="19"/>
               </w:rPr>
-              <w:t>hiro.FRESH_ROW_SEC</w:t>
+              <w:t>hiro.STALE_ROW_SEC</w:t>
             </w:r>
             <w:r>
               <w:rPr/>
@@ -27684,7 +27684,24 @@
         <w:br/>
         <w:t>stalled collector — or the rows simply stopping at 15:00 — re-firing the same old</w:t>
         <w:br/>
-        <w:t>window every time its cooldown lapses. A non-finite window or σ never fires.</w:t>
+        <w:t>window every time its cooldown lapses. It is 300 s, not one poll, because a row's</w:t>
+        <w:br/>
+      </w:r>
+      <w:r>
+        <w:rPr>
+          <w:rFonts w:ascii="Consolas" w:hAnsi="Consolas"/>
+          <w:color w:val="334455"/>
+          <w:sz w:val="19"/>
+        </w:rPr>
+        <w:t>ts</w:t>
+      </w:r>
+      <w:r>
+        <w:rPr/>
+        <w:t xml:space="preserve"> is the minute floor of the collect START and the check runs after a 30–90 s</w:t>
+        <w:br/>
+        <w:t>poll: a healthy newest row is routinely 90–150 s old, so a slow poll still counts</w:t>
+        <w:br/>
+        <w:t>and only a stalled collector does not. A non-finite window or σ never fires.</w:t>
       </w:r>
     </w:p>
     <w:p>
@@ -27819,9 +27836,19 @@
       </w:r>
       <w:r>
         <w:rPr/>
-        <w:t xml:space="preserve"> at most 120 s old against</w:t>
-        <w:br/>
-        <w:t>the clock (</w:t>
+        <w:t xml:space="preserve"> at most 120 s older than</w:t>
+        <w:br/>
+        <w:t xml:space="preserve">the </w:t>
+      </w:r>
+      <w:r>
+        <w:rPr>
+          <w:b/>
+        </w:rPr>
+        <w:t>newest stored row</w:t>
+      </w:r>
+      <w:r>
+        <w:rPr/>
+        <w:t xml:space="preserve"> (</w:t>
       </w:r>
       <w:r>
         <w:rPr>
@@ -27833,7 +27860,27 @@
       </w:r>
       <w:r>
         <w:rPr/>
-        <w:t>), so a restart cannot fire an old reversal.</w:t>
+        <w:t>), so a restart cannot fire an old</w:t>
+        <w:br/>
+        <w:t>reversal. The age is measured against the newest row, never the clock: a reversal</w:t>
+        <w:br/>
+        <w:t>refused on a slow tick would never be marked seen and would be lost for good, while</w:t>
+        <w:br/>
+        <w:t>the daily report (which replays with the clock at each row) counted it. The same</w:t>
+        <w:br/>
+        <w:t>300-s staleness check as the surge (</w:t>
+      </w:r>
+      <w:r>
+        <w:rPr>
+          <w:rFonts w:ascii="Consolas" w:hAnsi="Consolas"/>
+          <w:color w:val="334455"/>
+          <w:sz w:val="19"/>
+        </w:rPr>
+        <w:t>hiro.STALE_ROW_SEC</w:t>
+      </w:r>
+      <w:r>
+        <w:rPr/>
+        <w:t>) refuses it on frozen data.</w:t>
         <w:br/>
         <w:t xml:space="preserve">Cooldown </w:t>
       </w:r>

</xml_diff>